<commit_message>
Add architectural design notes explaining DTO and BCE
</commit_message>
<xml_diff>
--- a/N12 Nhóm 01 - HoanChinh.docx
+++ b/N12 Nhóm 01 - HoanChinh.docx
@@ -12241,6 +12241,126 @@
     <w:p>
       <w:pPr>
         <w:keepNext/>
+        <w:spacing w:before="160" w:after="60"/>
+      </w:pPr>
+      <w:r>
+        <w:rPr>
+          <w:rFonts w:ascii="Times New Roman" w:hAnsi="Times New Roman"/>
+          <w:b/>
+          <w:i/>
+          <w:color w:val="334155"/>
+          <w:sz w:val="23"/>
+        </w:rPr>
+        <w:t>e. Các ghi chú kiến trúc và thiết kế giải thích chi tiết sơ đồ (Architectural &amp; Design Notes)</w:t>
+      </w:r>
+    </w:p>
+    <w:p>
+      <w:pPr>
+        <w:spacing w:before="0" w:after="100" w:line="300" w:lineRule="auto"/>
+      </w:pPr>
+      <w:r>
+        <w:rPr>
+          <w:rFonts w:ascii="Times New Roman" w:hAnsi="Times New Roman"/>
+          <w:b/>
+          <w:color w:val="0F172A"/>
+          <w:sz w:val="23"/>
+        </w:rPr>
+        <w:t xml:space="preserve">1. Khái niệm DTO (Data Transfer Object) và lý do áp dụng: </w:t>
+      </w:r>
+      <w:r>
+        <w:rPr>
+          <w:rFonts w:ascii="Times New Roman" w:hAnsi="Times New Roman"/>
+          <w:color w:val="1E293B"/>
+          <w:sz w:val="23"/>
+        </w:rPr>
+        <w:t>Trong sơ đồ lớp thiết kế, RevenueSummaryDto (Data Transfer Object) và ZoneRevenueDto là các đối tượng truyền tải dữ liệu thuần túy (POJO) giữa tầng Điều khiển (RevenueReportController) và tầng Giao diện (RevenueReportView). Việc sử dụng DTO mang lại 3 lợi ích kiến trúc cốt lõi:</w:t>
+        <w:br/>
+        <w:t>1. Tính đóng gói và bảo mật (Encapsulation &amp; Security): DTO che giấu cấu trúc bảng cơ sở dữ liệu và các thông tin nghiệp vụ nội bộ nhạy cảm của Entity, không để lộ xuống tầng Presentation.</w:t>
+        <w:br/>
+        <w:t>2. Tối ưu hóa hiệu năng và làm phẳng dữ liệu (Flattening &amp; Performance): Thay vì truyền các đối tượng Entity phức tạp có liên kết vòng, Controller gọi các hàm tính toán của Entity, đóng gói toàn bộ kết quả đã tính toán (Gross Revenue, Net Revenue, Occupancy Rate, Performance Status) vào một đối tượng DTO phẳng, nhẹ. Giao diện người dùng (UI) chỉ việc đọc các giá trị này để hiển thị lên thẻ KPI và vẽ biểu đồ mà không cần tính toán lại.</w:t>
+        <w:br/>
+        <w:t>3. Giải quyết vấn đề Lazy Loading trong ORM: Khi sử dụng các framework ORM (như Hibernate/JPA), việc truy cập các thuộc tính liên kết lười ngoài phạm vi Session/Transaction dễ dẫn đến lỗi LazyInitializationException. DTO được khởi tạo bên trong ranh giới Service/Controller giải quyết triệt để lỗi này.</w:t>
+      </w:r>
+    </w:p>
+    <w:p>
+      <w:pPr>
+        <w:spacing w:before="0" w:after="100" w:line="300" w:lineRule="auto"/>
+      </w:pPr>
+      <w:r>
+        <w:rPr>
+          <w:rFonts w:ascii="Times New Roman" w:hAnsi="Times New Roman"/>
+          <w:b/>
+          <w:color w:val="0F172A"/>
+          <w:sz w:val="23"/>
+        </w:rPr>
+        <w:t xml:space="preserve">2. Phân tách vai trò theo mẫu thiết kế BCE (Boundary - Control - Entity): </w:t>
+      </w:r>
+      <w:r>
+        <w:rPr>
+          <w:rFonts w:ascii="Times New Roman" w:hAnsi="Times New Roman"/>
+          <w:color w:val="1E293B"/>
+          <w:sz w:val="23"/>
+        </w:rPr>
+        <w:t>Hệ thống áp dụng nghiêm ngặt mẫu phân rã trách nhiệm 3 lớp của Jacobson:</w:t>
+        <w:br/>
+        <w:t>• &lt;&lt;boundary&gt;&gt; (RevenueReportView): Lớp giao diện người dùng, chịu trách nhiệm nhận sự kiện tương tác (chọn sự kiện từ ComboBox) và kết xuất dữ liệu DTO lên màn hình (KPI cards, biểu đồ tròn phân khu).</w:t>
+        <w:br/>
+        <w:t>• &lt;&lt;control&gt;&gt; (RevenueReportController): Đóng vai trò điều phối luồng xử lý (Orchestrator). Controller không trực tiếp chứa các công thức toán học tính tiền, mà điều hướng: nhận yêu cầu từ View -&gt; nạp Entity -&gt; kích hoạt các hàm tính toán của Entity -&gt; đóng gói kết quả vào DTO -&gt; gửi trả View.</w:t>
+        <w:br/>
+        <w:t>• &lt;&lt;entity&gt;&gt; (RevenueReport, ZonePricing, Showtime, Event): Lớp thực thể nghiệp vụ chứa dữ liệu và trực tiếp đóng gói các thuật toán tính toán (Rich Domain Model).</w:t>
+        <w:br/>
+        <w:t>• &lt;&lt;enumeration&gt;&gt; (PerformanceStatus): Kiểu liệt kê định nghĩa tập hợp các giá trị đánh giá chuẩn mực (EXCELLENT, GOOD, AVERAGE, POOR).</w:t>
+        <w:br/>
+        <w:t>• &lt;&lt;dto&gt;&gt; (RevenueSummaryDto): Đối tượng mang dữ liệu kết quả giữa Control và Boundary.</w:t>
+      </w:r>
+    </w:p>
+    <w:p>
+      <w:pPr>
+        <w:spacing w:before="0" w:after="100" w:line="300" w:lineRule="auto"/>
+      </w:pPr>
+      <w:r>
+        <w:rPr>
+          <w:rFonts w:ascii="Times New Roman" w:hAnsi="Times New Roman"/>
+          <w:b/>
+          <w:color w:val="0F172A"/>
+          <w:sz w:val="23"/>
+        </w:rPr>
+        <w:t xml:space="preserve">3. Giải quyết quan hệ N-N giữa Showtime và SeatZone: </w:t>
+      </w:r>
+      <w:r>
+        <w:rPr>
+          <w:rFonts w:ascii="Times New Roman" w:hAnsi="Times New Roman"/>
+          <w:color w:val="1E293B"/>
+          <w:sz w:val="23"/>
+        </w:rPr>
+        <w:t>Mối quan hệ giữa Suất diễn (Showtime) và Phân khu ghế (SeatZone) về bản chất là quan hệ nhiều - nhiều (*..*). Tuy nhiên, tại mỗi suất diễn cụ thể, một phân khu sẽ có đơn giá vé riêng (price), chỉ tiêu phát hành riêng (maxQuota) và số vé đã bán thực tế riêng (soldCount). Do đó, lớp ZonePricing đóng vai trò là Lớp liên kết nghiệp vụ (Association Class), phân rã quan hệ *..* thành 2 quan hệ 1..* (Showtime 1 -&gt; * ZonePricing * -&gt; 1 SeatZone). Thiết kế này loại bỏ hoàn toàn sự dư thừa liên kết (Redundant Association) và phản ánh chính xác nghiệp vụ bán vé theo từng đêm diễn.</w:t>
+      </w:r>
+    </w:p>
+    <w:p>
+      <w:pPr>
+        <w:spacing w:before="0" w:after="100" w:line="300" w:lineRule="auto"/>
+      </w:pPr>
+      <w:r>
+        <w:rPr>
+          <w:rFonts w:ascii="Times New Roman" w:hAnsi="Times New Roman"/>
+          <w:b/>
+          <w:color w:val="0F172A"/>
+          <w:sz w:val="23"/>
+        </w:rPr>
+        <w:t xml:space="preserve">4. Nguyên lý đóng gói hành vi tính toán (Information Expert): </w:t>
+      </w:r>
+      <w:r>
+        <w:rPr>
+          <w:rFonts w:ascii="Times New Roman" w:hAnsi="Times New Roman"/>
+          <w:color w:val="1E293B"/>
+          <w:sz w:val="23"/>
+        </w:rPr>
+        <w:t>Theo nguyên lý Information Expert của GRASP, trách nhiệm tính toán phải được gán cho lớp sở hữu đầy đủ thông tin nhất để thực hiện tính toán đó. Do RevenueReport chứa tập hợp các phân khu ZonePricing và thuế phí, việc đặt các phương thức calculateGrossRevenue(), calculateNetRevenue(), calculateOccupancyRate() trực tiếp trong RevenueReport đảm bảo lớp có cả Trạng thái (State) và Hành vi (Behavior), đáp ứng tiêu chuẩn khắt khe của môn học, tránh mô hình Anemic Domain Model.</w:t>
+      </w:r>
+    </w:p>
+    <w:p>
+      <w:pPr>
+        <w:keepNext/>
         <w:spacing w:before="320" w:after="120"/>
       </w:pPr>
       <w:r>

</xml_diff>

<commit_message>
Synchronize analysis and design classes for Feature 5
</commit_message>
<xml_diff>
--- a/N12 Nhóm 01 - HoanChinh.docx
+++ b/N12 Nhóm 01 - HoanChinh.docx
@@ -7575,7 +7575,7 @@
           <w:color w:val="1E293B"/>
           <w:sz w:val="23"/>
         </w:rPr>
-        <w:t>Để đáp ứng nguyên tắc hướng đối tượng cốt lõi (Lớp phải đóng gói trạng thái và hành vi tính toán nghiệp vụ, không chỉ là tập hợp dữ liệu thụ động/Anemic Domain Model), biểu đồ lớp phân tích dưới đây thể hiện chi tiết các thực thể tham gia ca sử dụng đơn lẻ 'Xem thống kê doanh thu sự kiện' cùng các phương thức tính toán tài chính trọng tâm:</w:t>
+        <w:t>Để đáp ứng nguyên tắc hướng đối tượng cốt lõi (Lớp phải đóng gói trạng thái và hành vi tính toán nghiệp vụ, không chỉ là tập hợp dữ liệu thụ động/Anemic Domain Model), biểu đồ lớp phân tích dưới đây thể hiện chi tiết các thực thể tham gia ca sử dụng đơn lẻ 'Xem thống kê doanh thu sự kiện' cùng các phương thức tính toán tài chính trọng tâm. Toàn bộ tên lớp, thuộc tính và phương thức được chuẩn hóa đồng nhất 100% với pha thiết kế:</w:t>
       </w:r>
     </w:p>
     <w:p>
@@ -7634,6 +7634,597 @@
         </w:rPr>
         <w:t>Hình 3.6: Biểu đồ lớp thực thể phân tích - Chức năng Xem thống kê doanh thu sự kiện</w:t>
       </w:r>
+    </w:p>
+    <w:tbl>
+      <w:tblPr>
+        <w:tblW w:type="auto" w:w="0"/>
+        <w:jc w:val="center"/>
+        <w:tblLook w:firstColumn="1" w:firstRow="1" w:lastColumn="0" w:lastRow="0" w:noHBand="0" w:noVBand="1" w:val="04A0"/>
+        <w:tblBorders>
+          <w:top w:val="single" w:sz="6" w:space="0" w:color="CBD5E1"/>
+          <w:left w:val="none"/>
+          <w:bottom w:val="single" w:sz="8" w:space="0" w:color="1E3A8A"/>
+          <w:right w:val="none"/>
+          <w:insideH w:val="single" w:sz="4" w:space="0" w:color="CBD5E1"/>
+          <w:insideV w:val="none"/>
+        </w:tblBorders>
+      </w:tblPr>
+      <w:tblGrid>
+        <w:gridCol w:w="3134"/>
+        <w:gridCol w:w="3134"/>
+        <w:gridCol w:w="3134"/>
+      </w:tblGrid>
+      <w:tr>
+        <w:tc>
+          <w:tcPr>
+            <w:tcW w:type="dxa" w:w="2160"/>
+            <w:shd w:fill="1E3A8A"/>
+            <w:tcMar>
+              <w:top w:w="140" w:type="dxa"/>
+              <w:bottom w:w="140" w:type="dxa"/>
+              <w:left w:w="160" w:type="dxa"/>
+              <w:right w:w="160" w:type="dxa"/>
+            </w:tcMar>
+          </w:tcPr>
+          <w:p>
+            <w:pPr>
+              <w:jc w:val="center"/>
+            </w:pPr>
+            <w:r>
+              <w:rPr>
+                <w:rFonts w:ascii="Times New Roman" w:hAnsi="Times New Roman"/>
+                <w:b/>
+                <w:color w:val="FFFFFF"/>
+                <w:sz w:val="21"/>
+              </w:rPr>
+              <w:t>Lớp phân tích</w:t>
+            </w:r>
+          </w:p>
+        </w:tc>
+        <w:tc>
+          <w:tcPr>
+            <w:tcW w:type="dxa" w:w="3600"/>
+            <w:shd w:fill="1E3A8A"/>
+            <w:tcMar>
+              <w:top w:w="140" w:type="dxa"/>
+              <w:bottom w:w="140" w:type="dxa"/>
+              <w:left w:w="160" w:type="dxa"/>
+              <w:right w:w="160" w:type="dxa"/>
+            </w:tcMar>
+          </w:tcPr>
+          <w:p>
+            <w:pPr>
+              <w:jc w:val="center"/>
+            </w:pPr>
+            <w:r>
+              <w:rPr>
+                <w:rFonts w:ascii="Times New Roman" w:hAnsi="Times New Roman"/>
+                <w:b/>
+                <w:color w:val="FFFFFF"/>
+                <w:sz w:val="21"/>
+              </w:rPr>
+              <w:t>Các thuộc tính phân tích cốt lõi</w:t>
+            </w:r>
+          </w:p>
+        </w:tc>
+        <w:tc>
+          <w:tcPr>
+            <w:tcW w:type="dxa" w:w="3600"/>
+            <w:shd w:fill="1E3A8A"/>
+            <w:tcMar>
+              <w:top w:w="140" w:type="dxa"/>
+              <w:bottom w:w="140" w:type="dxa"/>
+              <w:left w:w="160" w:type="dxa"/>
+              <w:right w:w="160" w:type="dxa"/>
+            </w:tcMar>
+          </w:tcPr>
+          <w:p>
+            <w:pPr>
+              <w:jc w:val="center"/>
+            </w:pPr>
+            <w:r>
+              <w:rPr>
+                <w:rFonts w:ascii="Times New Roman" w:hAnsi="Times New Roman"/>
+                <w:b/>
+                <w:color w:val="FFFFFF"/>
+                <w:sz w:val="21"/>
+              </w:rPr>
+              <w:t>Các phương thức thực hiện tính toán (Operations)</w:t>
+            </w:r>
+          </w:p>
+        </w:tc>
+      </w:tr>
+      <w:tr>
+        <w:tc>
+          <w:tcPr>
+            <w:tcW w:type="dxa" w:w="2160"/>
+            <w:shd w:fill="FFFFFF"/>
+            <w:tcMar>
+              <w:top w:w="100" w:type="dxa"/>
+              <w:bottom w:w="100" w:type="dxa"/>
+              <w:left w:w="140" w:type="dxa"/>
+              <w:right w:w="140" w:type="dxa"/>
+            </w:tcMar>
+          </w:tcPr>
+          <w:p>
+            <w:pPr>
+              <w:jc w:val="center"/>
+            </w:pPr>
+            <w:r>
+              <w:rPr>
+                <w:rFonts w:ascii="Times New Roman" w:hAnsi="Times New Roman"/>
+                <w:color w:val="1E293B"/>
+                <w:sz w:val="20"/>
+              </w:rPr>
+              <w:t>RevenueReport</w:t>
+            </w:r>
+          </w:p>
+        </w:tc>
+        <w:tc>
+          <w:tcPr>
+            <w:tcW w:type="dxa" w:w="3600"/>
+            <w:shd w:fill="FFFFFF"/>
+            <w:tcMar>
+              <w:top w:w="100" w:type="dxa"/>
+              <w:bottom w:w="100" w:type="dxa"/>
+              <w:left w:w="140" w:type="dxa"/>
+              <w:right w:w="140" w:type="dxa"/>
+            </w:tcMar>
+          </w:tcPr>
+          <w:p>
+            <w:pPr>
+              <w:jc w:val="left"/>
+            </w:pPr>
+            <w:r>
+              <w:rPr>
+                <w:rFonts w:ascii="Times New Roman" w:hAnsi="Times New Roman"/>
+                <w:color w:val="1E293B"/>
+                <w:sz w:val="20"/>
+              </w:rPr>
+              <w:t>id, eventId, calculatedAt, taxRate, platformFeeRate, totalTicketsSold, grossRevenue, netRevenue, occupancyRate, averageTicketPrice</w:t>
+            </w:r>
+          </w:p>
+        </w:tc>
+        <w:tc>
+          <w:tcPr>
+            <w:tcW w:type="dxa" w:w="3600"/>
+            <w:shd w:fill="FFFFFF"/>
+            <w:tcMar>
+              <w:top w:w="100" w:type="dxa"/>
+              <w:bottom w:w="100" w:type="dxa"/>
+              <w:left w:w="140" w:type="dxa"/>
+              <w:right w:w="140" w:type="dxa"/>
+            </w:tcMar>
+          </w:tcPr>
+          <w:p>
+            <w:pPr>
+              <w:jc w:val="left"/>
+            </w:pPr>
+            <w:r>
+              <w:rPr>
+                <w:rFonts w:ascii="Times New Roman" w:hAnsi="Times New Roman"/>
+                <w:color w:val="1E293B"/>
+                <w:sz w:val="20"/>
+              </w:rPr>
+              <w:t>+ calculateTotalCapacity()</w:t>
+              <w:br/>
+              <w:t>+ calculateTotalTicketsSold()</w:t>
+              <w:br/>
+              <w:t>+ calculateGrossRevenue()</w:t>
+              <w:br/>
+              <w:t>+ calculateNetRevenue()</w:t>
+              <w:br/>
+              <w:t>+ calculateOccupancyRate()</w:t>
+              <w:br/>
+              <w:t>+ calculateAverageTicketPrice()</w:t>
+              <w:br/>
+              <w:t>+ calculateZoneContribution(zoneId)</w:t>
+              <w:br/>
+              <w:t>+ evaluatePerformance()</w:t>
+            </w:r>
+          </w:p>
+        </w:tc>
+      </w:tr>
+      <w:tr>
+        <w:tc>
+          <w:tcPr>
+            <w:tcW w:type="dxa" w:w="2160"/>
+            <w:shd w:fill="F8FAFC"/>
+            <w:tcMar>
+              <w:top w:w="100" w:type="dxa"/>
+              <w:bottom w:w="100" w:type="dxa"/>
+              <w:left w:w="140" w:type="dxa"/>
+              <w:right w:w="140" w:type="dxa"/>
+            </w:tcMar>
+          </w:tcPr>
+          <w:p>
+            <w:pPr>
+              <w:jc w:val="center"/>
+            </w:pPr>
+            <w:r>
+              <w:rPr>
+                <w:rFonts w:ascii="Times New Roman" w:hAnsi="Times New Roman"/>
+                <w:color w:val="1E293B"/>
+                <w:sz w:val="20"/>
+              </w:rPr>
+              <w:t>ZonePricing</w:t>
+            </w:r>
+          </w:p>
+        </w:tc>
+        <w:tc>
+          <w:tcPr>
+            <w:tcW w:type="dxa" w:w="3600"/>
+            <w:shd w:fill="F8FAFC"/>
+            <w:tcMar>
+              <w:top w:w="100" w:type="dxa"/>
+              <w:bottom w:w="100" w:type="dxa"/>
+              <w:left w:w="140" w:type="dxa"/>
+              <w:right w:w="140" w:type="dxa"/>
+            </w:tcMar>
+          </w:tcPr>
+          <w:p>
+            <w:pPr>
+              <w:jc w:val="left"/>
+            </w:pPr>
+            <w:r>
+              <w:rPr>
+                <w:rFonts w:ascii="Times New Roman" w:hAnsi="Times New Roman"/>
+                <w:color w:val="1E293B"/>
+                <w:sz w:val="20"/>
+              </w:rPr>
+              <w:t>id, zoneName, price, maxQuota, soldCount</w:t>
+            </w:r>
+          </w:p>
+        </w:tc>
+        <w:tc>
+          <w:tcPr>
+            <w:tcW w:type="dxa" w:w="3600"/>
+            <w:shd w:fill="F8FAFC"/>
+            <w:tcMar>
+              <w:top w:w="100" w:type="dxa"/>
+              <w:bottom w:w="100" w:type="dxa"/>
+              <w:left w:w="140" w:type="dxa"/>
+              <w:right w:w="140" w:type="dxa"/>
+            </w:tcMar>
+          </w:tcPr>
+          <w:p>
+            <w:pPr>
+              <w:jc w:val="left"/>
+            </w:pPr>
+            <w:r>
+              <w:rPr>
+                <w:rFonts w:ascii="Times New Roman" w:hAnsi="Times New Roman"/>
+                <w:color w:val="1E293B"/>
+                <w:sz w:val="20"/>
+              </w:rPr>
+              <w:t>+ calculateZoneGross()</w:t>
+              <w:br/>
+              <w:t>+ calculateRemainingSeats()</w:t>
+              <w:br/>
+              <w:t>+ getSoldRate()</w:t>
+              <w:br/>
+              <w:t>+ isSoldOut()</w:t>
+            </w:r>
+          </w:p>
+        </w:tc>
+      </w:tr>
+      <w:tr>
+        <w:tc>
+          <w:tcPr>
+            <w:tcW w:type="dxa" w:w="2160"/>
+            <w:shd w:fill="FFFFFF"/>
+            <w:tcMar>
+              <w:top w:w="100" w:type="dxa"/>
+              <w:bottom w:w="100" w:type="dxa"/>
+              <w:left w:w="140" w:type="dxa"/>
+              <w:right w:w="140" w:type="dxa"/>
+            </w:tcMar>
+          </w:tcPr>
+          <w:p>
+            <w:pPr>
+              <w:jc w:val="center"/>
+            </w:pPr>
+            <w:r>
+              <w:rPr>
+                <w:rFonts w:ascii="Times New Roman" w:hAnsi="Times New Roman"/>
+                <w:color w:val="1E293B"/>
+                <w:sz w:val="20"/>
+              </w:rPr>
+              <w:t>Showtime</w:t>
+            </w:r>
+          </w:p>
+        </w:tc>
+        <w:tc>
+          <w:tcPr>
+            <w:tcW w:type="dxa" w:w="3600"/>
+            <w:shd w:fill="FFFFFF"/>
+            <w:tcMar>
+              <w:top w:w="100" w:type="dxa"/>
+              <w:bottom w:w="100" w:type="dxa"/>
+              <w:left w:w="140" w:type="dxa"/>
+              <w:right w:w="140" w:type="dxa"/>
+            </w:tcMar>
+          </w:tcPr>
+          <w:p>
+            <w:pPr>
+              <w:jc w:val="left"/>
+            </w:pPr>
+            <w:r>
+              <w:rPr>
+                <w:rFonts w:ascii="Times New Roman" w:hAnsi="Times New Roman"/>
+                <w:color w:val="1E293B"/>
+                <w:sz w:val="20"/>
+              </w:rPr>
+              <w:t>id, showDate, startTime, endTime</w:t>
+            </w:r>
+          </w:p>
+        </w:tc>
+        <w:tc>
+          <w:tcPr>
+            <w:tcW w:type="dxa" w:w="3600"/>
+            <w:shd w:fill="FFFFFF"/>
+            <w:tcMar>
+              <w:top w:w="100" w:type="dxa"/>
+              <w:bottom w:w="100" w:type="dxa"/>
+              <w:left w:w="140" w:type="dxa"/>
+              <w:right w:w="140" w:type="dxa"/>
+            </w:tcMar>
+          </w:tcPr>
+          <w:p>
+            <w:pPr>
+              <w:jc w:val="left"/>
+            </w:pPr>
+            <w:r>
+              <w:rPr>
+                <w:rFonts w:ascii="Times New Roman" w:hAnsi="Times New Roman"/>
+                <w:color w:val="1E293B"/>
+                <w:sz w:val="20"/>
+              </w:rPr>
+              <w:t>+ calculateShowtimeRevenue()</w:t>
+              <w:br/>
+              <w:t>+ getSoldTicketsCount()</w:t>
+            </w:r>
+          </w:p>
+        </w:tc>
+      </w:tr>
+      <w:tr>
+        <w:tc>
+          <w:tcPr>
+            <w:tcW w:type="dxa" w:w="2160"/>
+            <w:shd w:fill="F8FAFC"/>
+            <w:tcMar>
+              <w:top w:w="100" w:type="dxa"/>
+              <w:bottom w:w="100" w:type="dxa"/>
+              <w:left w:w="140" w:type="dxa"/>
+              <w:right w:w="140" w:type="dxa"/>
+            </w:tcMar>
+          </w:tcPr>
+          <w:p>
+            <w:pPr>
+              <w:jc w:val="center"/>
+            </w:pPr>
+            <w:r>
+              <w:rPr>
+                <w:rFonts w:ascii="Times New Roman" w:hAnsi="Times New Roman"/>
+                <w:color w:val="1E293B"/>
+                <w:sz w:val="20"/>
+              </w:rPr>
+              <w:t>Event</w:t>
+            </w:r>
+          </w:p>
+        </w:tc>
+        <w:tc>
+          <w:tcPr>
+            <w:tcW w:type="dxa" w:w="3600"/>
+            <w:shd w:fill="F8FAFC"/>
+            <w:tcMar>
+              <w:top w:w="100" w:type="dxa"/>
+              <w:bottom w:w="100" w:type="dxa"/>
+              <w:left w:w="140" w:type="dxa"/>
+              <w:right w:w="140" w:type="dxa"/>
+            </w:tcMar>
+          </w:tcPr>
+          <w:p>
+            <w:pPr>
+              <w:jc w:val="left"/>
+            </w:pPr>
+            <w:r>
+              <w:rPr>
+                <w:rFonts w:ascii="Times New Roman" w:hAnsi="Times New Roman"/>
+                <w:color w:val="1E293B"/>
+                <w:sz w:val="20"/>
+              </w:rPr>
+              <w:t>id, title, category, status</w:t>
+            </w:r>
+          </w:p>
+        </w:tc>
+        <w:tc>
+          <w:tcPr>
+            <w:tcW w:type="dxa" w:w="3600"/>
+            <w:shd w:fill="F8FAFC"/>
+            <w:tcMar>
+              <w:top w:w="100" w:type="dxa"/>
+              <w:bottom w:w="100" w:type="dxa"/>
+              <w:left w:w="140" w:type="dxa"/>
+              <w:right w:w="140" w:type="dxa"/>
+            </w:tcMar>
+          </w:tcPr>
+          <w:p>
+            <w:pPr>
+              <w:jc w:val="left"/>
+            </w:pPr>
+            <w:r>
+              <w:rPr>
+                <w:rFonts w:ascii="Times New Roman" w:hAnsi="Times New Roman"/>
+                <w:color w:val="1E293B"/>
+                <w:sz w:val="20"/>
+              </w:rPr>
+              <w:t>+ getTotalCapacity()</w:t>
+              <w:br/>
+              <w:t>+ getShowtimes()</w:t>
+            </w:r>
+          </w:p>
+        </w:tc>
+      </w:tr>
+      <w:tr>
+        <w:tc>
+          <w:tcPr>
+            <w:tcW w:type="dxa" w:w="2160"/>
+            <w:shd w:fill="FFFFFF"/>
+            <w:tcMar>
+              <w:top w:w="100" w:type="dxa"/>
+              <w:bottom w:w="100" w:type="dxa"/>
+              <w:left w:w="140" w:type="dxa"/>
+              <w:right w:w="140" w:type="dxa"/>
+            </w:tcMar>
+          </w:tcPr>
+          <w:p>
+            <w:pPr>
+              <w:jc w:val="center"/>
+            </w:pPr>
+            <w:r>
+              <w:rPr>
+                <w:rFonts w:ascii="Times New Roman" w:hAnsi="Times New Roman"/>
+                <w:color w:val="1E293B"/>
+                <w:sz w:val="20"/>
+              </w:rPr>
+              <w:t>SeatZone</w:t>
+            </w:r>
+          </w:p>
+        </w:tc>
+        <w:tc>
+          <w:tcPr>
+            <w:tcW w:type="dxa" w:w="3600"/>
+            <w:shd w:fill="FFFFFF"/>
+            <w:tcMar>
+              <w:top w:w="100" w:type="dxa"/>
+              <w:bottom w:w="100" w:type="dxa"/>
+              <w:left w:w="140" w:type="dxa"/>
+              <w:right w:w="140" w:type="dxa"/>
+            </w:tcMar>
+          </w:tcPr>
+          <w:p>
+            <w:pPr>
+              <w:jc w:val="left"/>
+            </w:pPr>
+            <w:r>
+              <w:rPr>
+                <w:rFonts w:ascii="Times New Roman" w:hAnsi="Times New Roman"/>
+                <w:color w:val="1E293B"/>
+                <w:sz w:val="20"/>
+              </w:rPr>
+              <w:t>id, zoneName, colorHex, seatCount</w:t>
+            </w:r>
+          </w:p>
+        </w:tc>
+        <w:tc>
+          <w:tcPr>
+            <w:tcW w:type="dxa" w:w="3600"/>
+            <w:shd w:fill="FFFFFF"/>
+            <w:tcMar>
+              <w:top w:w="100" w:type="dxa"/>
+              <w:bottom w:w="100" w:type="dxa"/>
+              <w:left w:w="140" w:type="dxa"/>
+              <w:right w:w="140" w:type="dxa"/>
+            </w:tcMar>
+          </w:tcPr>
+          <w:p>
+            <w:pPr>
+              <w:jc w:val="left"/>
+            </w:pPr>
+            <w:r>
+              <w:rPr>
+                <w:rFonts w:ascii="Times New Roman" w:hAnsi="Times New Roman"/>
+                <w:color w:val="1E293B"/>
+                <w:sz w:val="20"/>
+              </w:rPr>
+              <w:t>+ countTotalSeats()</w:t>
+            </w:r>
+          </w:p>
+        </w:tc>
+      </w:tr>
+      <w:tr>
+        <w:tc>
+          <w:tcPr>
+            <w:tcW w:type="dxa" w:w="2160"/>
+            <w:shd w:fill="F8FAFC"/>
+            <w:tcMar>
+              <w:top w:w="100" w:type="dxa"/>
+              <w:bottom w:w="100" w:type="dxa"/>
+              <w:left w:w="140" w:type="dxa"/>
+              <w:right w:w="140" w:type="dxa"/>
+            </w:tcMar>
+          </w:tcPr>
+          <w:p>
+            <w:pPr>
+              <w:jc w:val="center"/>
+            </w:pPr>
+            <w:r>
+              <w:rPr>
+                <w:rFonts w:ascii="Times New Roman" w:hAnsi="Times New Roman"/>
+                <w:color w:val="1E293B"/>
+                <w:sz w:val="20"/>
+              </w:rPr>
+              <w:t>Organizer</w:t>
+            </w:r>
+          </w:p>
+        </w:tc>
+        <w:tc>
+          <w:tcPr>
+            <w:tcW w:type="dxa" w:w="3600"/>
+            <w:shd w:fill="F8FAFC"/>
+            <w:tcMar>
+              <w:top w:w="100" w:type="dxa"/>
+              <w:bottom w:w="100" w:type="dxa"/>
+              <w:left w:w="140" w:type="dxa"/>
+              <w:right w:w="140" w:type="dxa"/>
+            </w:tcMar>
+          </w:tcPr>
+          <w:p>
+            <w:pPr>
+              <w:jc w:val="left"/>
+            </w:pPr>
+            <w:r>
+              <w:rPr>
+                <w:rFonts w:ascii="Times New Roman" w:hAnsi="Times New Roman"/>
+                <w:color w:val="1E293B"/>
+                <w:sz w:val="20"/>
+              </w:rPr>
+              <w:t>id, companyName, taxId, email</w:t>
+            </w:r>
+          </w:p>
+        </w:tc>
+        <w:tc>
+          <w:tcPr>
+            <w:tcW w:type="dxa" w:w="3600"/>
+            <w:shd w:fill="F8FAFC"/>
+            <w:tcMar>
+              <w:top w:w="100" w:type="dxa"/>
+              <w:bottom w:w="100" w:type="dxa"/>
+              <w:left w:w="140" w:type="dxa"/>
+              <w:right w:w="140" w:type="dxa"/>
+            </w:tcMar>
+          </w:tcPr>
+          <w:p>
+            <w:pPr>
+              <w:jc w:val="left"/>
+            </w:pPr>
+            <w:r>
+              <w:rPr>
+                <w:rFonts w:ascii="Times New Roman" w:hAnsi="Times New Roman"/>
+                <w:color w:val="1E293B"/>
+                <w:sz w:val="20"/>
+              </w:rPr>
+              <w:t>+ viewReports(eventId)</w:t>
+            </w:r>
+          </w:p>
+        </w:tc>
+      </w:tr>
+    </w:tbl>
+    <w:p>
+      <w:pPr>
+        <w:spacing w:before="0" w:after="120"/>
+      </w:pPr>
     </w:p>
     <w:p>
       <w:pPr>
@@ -10962,7 +11553,7 @@
           <w:color w:val="334155"/>
           <w:sz w:val="23"/>
         </w:rPr>
-        <w:t>c. Biểu đồ lớp thiết kế chi tiết theo mô hình BCE</w:t>
+        <w:t>c. Biểu đồ lớp thiết kế chi tiết theo mô hình BCE &amp; DTO</w:t>
       </w:r>
     </w:p>
     <w:p>
@@ -10975,7 +11566,7 @@
           <w:color w:val="1E293B"/>
           <w:sz w:val="23"/>
         </w:rPr>
-        <w:t>Mô hình thiết kế 3 lớp (Boundary - Control - Entity) làm nổi bật các phương thức tính toán nghiệp vụ trong các lớp thực thể RevenueReport và ZonePricing:</w:t>
+        <w:t>Mô hình thiết kế 3 lớp (Boundary - Control - Entity) kết hợp tầng DTO làm nổi bật các phương thức tính toán nghiệp vụ trong các lớp thực thể RevenueReport và ZonePricing. Toàn bộ tên biến, kiểu dữ liệu chuẩn và phương thức tương ứng đồng nhất 100% với pha phân tích:</w:t>
       </w:r>
     </w:p>
     <w:p>
@@ -11032,8 +11623,766 @@
           <w:color w:val="475569"/>
           <w:sz w:val="20"/>
         </w:rPr>
-        <w:t>Hình 4.7: Biểu đồ lớp thiết kế chi tiết (BCE) chức năng Thống kê doanh thu</w:t>
+        <w:t>Hình 4.7: Biểu đồ lớp thiết kế chi tiết (BCE &amp; DTO) chức năng Thống kê doanh thu</w:t>
       </w:r>
+    </w:p>
+    <w:tbl>
+      <w:tblPr>
+        <w:tblW w:type="auto" w:w="0"/>
+        <w:jc w:val="center"/>
+        <w:tblLook w:firstColumn="1" w:firstRow="1" w:lastColumn="0" w:lastRow="0" w:noHBand="0" w:noVBand="1" w:val="04A0"/>
+        <w:tblBorders>
+          <w:top w:val="single" w:sz="6" w:space="0" w:color="CBD5E1"/>
+          <w:left w:val="none"/>
+          <w:bottom w:val="single" w:sz="8" w:space="0" w:color="1E3A8A"/>
+          <w:right w:val="none"/>
+          <w:insideH w:val="single" w:sz="4" w:space="0" w:color="CBD5E1"/>
+          <w:insideV w:val="none"/>
+        </w:tblBorders>
+      </w:tblPr>
+      <w:tblGrid>
+        <w:gridCol w:w="3134"/>
+        <w:gridCol w:w="3134"/>
+        <w:gridCol w:w="3134"/>
+      </w:tblGrid>
+      <w:tr>
+        <w:tc>
+          <w:tcPr>
+            <w:tcW w:type="dxa" w:w="2160"/>
+            <w:shd w:fill="1E3A8A"/>
+            <w:tcMar>
+              <w:top w:w="140" w:type="dxa"/>
+              <w:bottom w:w="140" w:type="dxa"/>
+              <w:left w:w="160" w:type="dxa"/>
+              <w:right w:w="160" w:type="dxa"/>
+            </w:tcMar>
+          </w:tcPr>
+          <w:p>
+            <w:pPr>
+              <w:jc w:val="center"/>
+            </w:pPr>
+            <w:r>
+              <w:rPr>
+                <w:rFonts w:ascii="Times New Roman" w:hAnsi="Times New Roman"/>
+                <w:b/>
+                <w:color w:val="FFFFFF"/>
+                <w:sz w:val="21"/>
+              </w:rPr>
+              <w:t>Lớp thiết kế</w:t>
+            </w:r>
+          </w:p>
+        </w:tc>
+        <w:tc>
+          <w:tcPr>
+            <w:tcW w:type="dxa" w:w="3600"/>
+            <w:shd w:fill="1E3A8A"/>
+            <w:tcMar>
+              <w:top w:w="140" w:type="dxa"/>
+              <w:bottom w:w="140" w:type="dxa"/>
+              <w:left w:w="160" w:type="dxa"/>
+              <w:right w:w="160" w:type="dxa"/>
+            </w:tcMar>
+          </w:tcPr>
+          <w:p>
+            <w:pPr>
+              <w:jc w:val="center"/>
+            </w:pPr>
+            <w:r>
+              <w:rPr>
+                <w:rFonts w:ascii="Times New Roman" w:hAnsi="Times New Roman"/>
+                <w:b/>
+                <w:color w:val="FFFFFF"/>
+                <w:sz w:val="21"/>
+              </w:rPr>
+              <w:t>Thuộc tính chi tiết (Kiểu dữ liệu &amp; Ràng buộc)</w:t>
+            </w:r>
+          </w:p>
+        </w:tc>
+        <w:tc>
+          <w:tcPr>
+            <w:tcW w:type="dxa" w:w="3600"/>
+            <w:shd w:fill="1E3A8A"/>
+            <w:tcMar>
+              <w:top w:w="140" w:type="dxa"/>
+              <w:bottom w:w="140" w:type="dxa"/>
+              <w:left w:w="160" w:type="dxa"/>
+              <w:right w:w="160" w:type="dxa"/>
+            </w:tcMar>
+          </w:tcPr>
+          <w:p>
+            <w:pPr>
+              <w:jc w:val="center"/>
+            </w:pPr>
+            <w:r>
+              <w:rPr>
+                <w:rFonts w:ascii="Times New Roman" w:hAnsi="Times New Roman"/>
+                <w:b/>
+                <w:color w:val="FFFFFF"/>
+                <w:sz w:val="21"/>
+              </w:rPr>
+              <w:t>Phương thức nghiệp vụ &amp; Tính toán</w:t>
+            </w:r>
+          </w:p>
+        </w:tc>
+      </w:tr>
+      <w:tr>
+        <w:tc>
+          <w:tcPr>
+            <w:tcW w:type="dxa" w:w="2160"/>
+            <w:shd w:fill="FFFFFF"/>
+            <w:tcMar>
+              <w:top w:w="100" w:type="dxa"/>
+              <w:bottom w:w="100" w:type="dxa"/>
+              <w:left w:w="140" w:type="dxa"/>
+              <w:right w:w="140" w:type="dxa"/>
+            </w:tcMar>
+          </w:tcPr>
+          <w:p>
+            <w:pPr>
+              <w:jc w:val="center"/>
+            </w:pPr>
+            <w:r>
+              <w:rPr>
+                <w:rFonts w:ascii="Times New Roman" w:hAnsi="Times New Roman"/>
+                <w:color w:val="1E293B"/>
+                <w:sz w:val="20"/>
+              </w:rPr>
+              <w:t>RevenueReport</w:t>
+              <w:br/>
+              <w:t>(&lt;&lt;entity&gt;&gt;)</w:t>
+            </w:r>
+          </w:p>
+        </w:tc>
+        <w:tc>
+          <w:tcPr>
+            <w:tcW w:type="dxa" w:w="3600"/>
+            <w:shd w:fill="FFFFFF"/>
+            <w:tcMar>
+              <w:top w:w="100" w:type="dxa"/>
+              <w:bottom w:w="100" w:type="dxa"/>
+              <w:left w:w="140" w:type="dxa"/>
+              <w:right w:w="140" w:type="dxa"/>
+            </w:tcMar>
+          </w:tcPr>
+          <w:p>
+            <w:pPr>
+              <w:jc w:val="left"/>
+            </w:pPr>
+            <w:r>
+              <w:rPr>
+                <w:rFonts w:ascii="Times New Roman" w:hAnsi="Times New Roman"/>
+                <w:color w:val="1E293B"/>
+                <w:sz w:val="20"/>
+              </w:rPr>
+              <w:t>- id: Long [PK]</w:t>
+              <w:br/>
+              <w:t>- eventId: Long [FK]</w:t>
+              <w:br/>
+              <w:t>- calculatedAt: LocalDateTime</w:t>
+              <w:br/>
+              <w:t>- taxRate: double</w:t>
+              <w:br/>
+              <w:t>- platformFeeRate: double</w:t>
+              <w:br/>
+              <w:t>- totalTicketsSold: int</w:t>
+              <w:br/>
+              <w:t>- grossRevenue: double</w:t>
+              <w:br/>
+              <w:t>- netRevenue: double</w:t>
+              <w:br/>
+              <w:t>- occupancyRate: double</w:t>
+              <w:br/>
+              <w:t>- averageTicketPrice: double</w:t>
+            </w:r>
+          </w:p>
+        </w:tc>
+        <w:tc>
+          <w:tcPr>
+            <w:tcW w:type="dxa" w:w="3600"/>
+            <w:shd w:fill="FFFFFF"/>
+            <w:tcMar>
+              <w:top w:w="100" w:type="dxa"/>
+              <w:bottom w:w="100" w:type="dxa"/>
+              <w:left w:w="140" w:type="dxa"/>
+              <w:right w:w="140" w:type="dxa"/>
+            </w:tcMar>
+          </w:tcPr>
+          <w:p>
+            <w:pPr>
+              <w:jc w:val="left"/>
+            </w:pPr>
+            <w:r>
+              <w:rPr>
+                <w:rFonts w:ascii="Times New Roman" w:hAnsi="Times New Roman"/>
+                <w:color w:val="1E293B"/>
+                <w:sz w:val="20"/>
+              </w:rPr>
+              <w:t>+ calculateTotalCapacity(): int</w:t>
+              <w:br/>
+              <w:t>+ calculateTotalTicketsSold(): int</w:t>
+              <w:br/>
+              <w:t>+ calculateGrossRevenue(): double</w:t>
+              <w:br/>
+              <w:t>+ calculateNetRevenue(): double</w:t>
+              <w:br/>
+              <w:t>+ calculateOccupancyRate(): double</w:t>
+              <w:br/>
+              <w:t>+ calculateAverageTicketPrice(): double</w:t>
+              <w:br/>
+              <w:t>+ calculateZoneContribution(zoneId: Long): double</w:t>
+              <w:br/>
+              <w:t>+ evaluatePerformance(): PerformanceStatus</w:t>
+              <w:br/>
+              <w:t>+ exportExcel(): byte[]</w:t>
+              <w:br/>
+              <w:t>+ exportPdf(): byte[]</w:t>
+            </w:r>
+          </w:p>
+        </w:tc>
+      </w:tr>
+      <w:tr>
+        <w:tc>
+          <w:tcPr>
+            <w:tcW w:type="dxa" w:w="2160"/>
+            <w:shd w:fill="F8FAFC"/>
+            <w:tcMar>
+              <w:top w:w="100" w:type="dxa"/>
+              <w:bottom w:w="100" w:type="dxa"/>
+              <w:left w:w="140" w:type="dxa"/>
+              <w:right w:w="140" w:type="dxa"/>
+            </w:tcMar>
+          </w:tcPr>
+          <w:p>
+            <w:pPr>
+              <w:jc w:val="center"/>
+            </w:pPr>
+            <w:r>
+              <w:rPr>
+                <w:rFonts w:ascii="Times New Roman" w:hAnsi="Times New Roman"/>
+                <w:color w:val="1E293B"/>
+                <w:sz w:val="20"/>
+              </w:rPr>
+              <w:t>ZonePricing</w:t>
+              <w:br/>
+              <w:t>(&lt;&lt;entity&gt;&gt;)</w:t>
+            </w:r>
+          </w:p>
+        </w:tc>
+        <w:tc>
+          <w:tcPr>
+            <w:tcW w:type="dxa" w:w="3600"/>
+            <w:shd w:fill="F8FAFC"/>
+            <w:tcMar>
+              <w:top w:w="100" w:type="dxa"/>
+              <w:bottom w:w="100" w:type="dxa"/>
+              <w:left w:w="140" w:type="dxa"/>
+              <w:right w:w="140" w:type="dxa"/>
+            </w:tcMar>
+          </w:tcPr>
+          <w:p>
+            <w:pPr>
+              <w:jc w:val="left"/>
+            </w:pPr>
+            <w:r>
+              <w:rPr>
+                <w:rFonts w:ascii="Times New Roman" w:hAnsi="Times New Roman"/>
+                <w:color w:val="1E293B"/>
+                <w:sz w:val="20"/>
+              </w:rPr>
+              <w:t>- id: Long [PK]</w:t>
+              <w:br/>
+              <w:t>- zoneName: String</w:t>
+              <w:br/>
+              <w:t>- price: double [&gt;= 0]</w:t>
+              <w:br/>
+              <w:t>- maxQuota: int</w:t>
+              <w:br/>
+              <w:t>- soldCount: int</w:t>
+            </w:r>
+          </w:p>
+        </w:tc>
+        <w:tc>
+          <w:tcPr>
+            <w:tcW w:type="dxa" w:w="3600"/>
+            <w:shd w:fill="F8FAFC"/>
+            <w:tcMar>
+              <w:top w:w="100" w:type="dxa"/>
+              <w:bottom w:w="100" w:type="dxa"/>
+              <w:left w:w="140" w:type="dxa"/>
+              <w:right w:w="140" w:type="dxa"/>
+            </w:tcMar>
+          </w:tcPr>
+          <w:p>
+            <w:pPr>
+              <w:jc w:val="left"/>
+            </w:pPr>
+            <w:r>
+              <w:rPr>
+                <w:rFonts w:ascii="Times New Roman" w:hAnsi="Times New Roman"/>
+                <w:color w:val="1E293B"/>
+                <w:sz w:val="20"/>
+              </w:rPr>
+              <w:t>+ calculateZoneGross(): double</w:t>
+              <w:br/>
+              <w:t>+ calculateRemainingSeats(): int</w:t>
+              <w:br/>
+              <w:t>+ getSoldRate(): double</w:t>
+              <w:br/>
+              <w:t>+ isSoldOut(): boolean</w:t>
+              <w:br/>
+              <w:t>+ recordSale(quantity: int): void</w:t>
+            </w:r>
+          </w:p>
+        </w:tc>
+      </w:tr>
+      <w:tr>
+        <w:tc>
+          <w:tcPr>
+            <w:tcW w:type="dxa" w:w="2160"/>
+            <w:shd w:fill="FFFFFF"/>
+            <w:tcMar>
+              <w:top w:w="100" w:type="dxa"/>
+              <w:bottom w:w="100" w:type="dxa"/>
+              <w:left w:w="140" w:type="dxa"/>
+              <w:right w:w="140" w:type="dxa"/>
+            </w:tcMar>
+          </w:tcPr>
+          <w:p>
+            <w:pPr>
+              <w:jc w:val="center"/>
+            </w:pPr>
+            <w:r>
+              <w:rPr>
+                <w:rFonts w:ascii="Times New Roman" w:hAnsi="Times New Roman"/>
+                <w:color w:val="1E293B"/>
+                <w:sz w:val="20"/>
+              </w:rPr>
+              <w:t>Showtime</w:t>
+              <w:br/>
+              <w:t>(&lt;&lt;entity&gt;&gt;)</w:t>
+            </w:r>
+          </w:p>
+        </w:tc>
+        <w:tc>
+          <w:tcPr>
+            <w:tcW w:type="dxa" w:w="3600"/>
+            <w:shd w:fill="FFFFFF"/>
+            <w:tcMar>
+              <w:top w:w="100" w:type="dxa"/>
+              <w:bottom w:w="100" w:type="dxa"/>
+              <w:left w:w="140" w:type="dxa"/>
+              <w:right w:w="140" w:type="dxa"/>
+            </w:tcMar>
+          </w:tcPr>
+          <w:p>
+            <w:pPr>
+              <w:jc w:val="left"/>
+            </w:pPr>
+            <w:r>
+              <w:rPr>
+                <w:rFonts w:ascii="Times New Roman" w:hAnsi="Times New Roman"/>
+                <w:color w:val="1E293B"/>
+                <w:sz w:val="20"/>
+              </w:rPr>
+              <w:t>- id: Long [PK]</w:t>
+              <w:br/>
+              <w:t>- showDate: LocalDate</w:t>
+              <w:br/>
+              <w:t>- startTime: LocalTime</w:t>
+              <w:br/>
+              <w:t>- endTime: LocalTime</w:t>
+            </w:r>
+          </w:p>
+        </w:tc>
+        <w:tc>
+          <w:tcPr>
+            <w:tcW w:type="dxa" w:w="3600"/>
+            <w:shd w:fill="FFFFFF"/>
+            <w:tcMar>
+              <w:top w:w="100" w:type="dxa"/>
+              <w:bottom w:w="100" w:type="dxa"/>
+              <w:left w:w="140" w:type="dxa"/>
+              <w:right w:w="140" w:type="dxa"/>
+            </w:tcMar>
+          </w:tcPr>
+          <w:p>
+            <w:pPr>
+              <w:jc w:val="left"/>
+            </w:pPr>
+            <w:r>
+              <w:rPr>
+                <w:rFonts w:ascii="Times New Roman" w:hAnsi="Times New Roman"/>
+                <w:color w:val="1E293B"/>
+                <w:sz w:val="20"/>
+              </w:rPr>
+              <w:t>+ calculateShowtimeRevenue(): double</w:t>
+              <w:br/>
+              <w:t>+ getSoldTicketsCount(): int</w:t>
+              <w:br/>
+              <w:t>+ isPublished(): boolean</w:t>
+            </w:r>
+          </w:p>
+        </w:tc>
+      </w:tr>
+      <w:tr>
+        <w:tc>
+          <w:tcPr>
+            <w:tcW w:type="dxa" w:w="2160"/>
+            <w:shd w:fill="F8FAFC"/>
+            <w:tcMar>
+              <w:top w:w="100" w:type="dxa"/>
+              <w:bottom w:w="100" w:type="dxa"/>
+              <w:left w:w="140" w:type="dxa"/>
+              <w:right w:w="140" w:type="dxa"/>
+            </w:tcMar>
+          </w:tcPr>
+          <w:p>
+            <w:pPr>
+              <w:jc w:val="center"/>
+            </w:pPr>
+            <w:r>
+              <w:rPr>
+                <w:rFonts w:ascii="Times New Roman" w:hAnsi="Times New Roman"/>
+                <w:color w:val="1E293B"/>
+                <w:sz w:val="20"/>
+              </w:rPr>
+              <w:t>Event</w:t>
+              <w:br/>
+              <w:t>(&lt;&lt;entity&gt;&gt;)</w:t>
+            </w:r>
+          </w:p>
+        </w:tc>
+        <w:tc>
+          <w:tcPr>
+            <w:tcW w:type="dxa" w:w="3600"/>
+            <w:shd w:fill="F8FAFC"/>
+            <w:tcMar>
+              <w:top w:w="100" w:type="dxa"/>
+              <w:bottom w:w="100" w:type="dxa"/>
+              <w:left w:w="140" w:type="dxa"/>
+              <w:right w:w="140" w:type="dxa"/>
+            </w:tcMar>
+          </w:tcPr>
+          <w:p>
+            <w:pPr>
+              <w:jc w:val="left"/>
+            </w:pPr>
+            <w:r>
+              <w:rPr>
+                <w:rFonts w:ascii="Times New Roman" w:hAnsi="Times New Roman"/>
+                <w:color w:val="1E293B"/>
+                <w:sz w:val="20"/>
+              </w:rPr>
+              <w:t>- id: Long [PK]</w:t>
+              <w:br/>
+              <w:t>- title: String</w:t>
+              <w:br/>
+              <w:t>- category: String</w:t>
+              <w:br/>
+              <w:t>- status: EventStatus</w:t>
+            </w:r>
+          </w:p>
+        </w:tc>
+        <w:tc>
+          <w:tcPr>
+            <w:tcW w:type="dxa" w:w="3600"/>
+            <w:shd w:fill="F8FAFC"/>
+            <w:tcMar>
+              <w:top w:w="100" w:type="dxa"/>
+              <w:bottom w:w="100" w:type="dxa"/>
+              <w:left w:w="140" w:type="dxa"/>
+              <w:right w:w="140" w:type="dxa"/>
+            </w:tcMar>
+          </w:tcPr>
+          <w:p>
+            <w:pPr>
+              <w:jc w:val="left"/>
+            </w:pPr>
+            <w:r>
+              <w:rPr>
+                <w:rFonts w:ascii="Times New Roman" w:hAnsi="Times New Roman"/>
+                <w:color w:val="1E293B"/>
+                <w:sz w:val="20"/>
+              </w:rPr>
+              <w:t>+ getTotalCapacity(): int</w:t>
+              <w:br/>
+              <w:t>+ getShowtimes(): List&lt;Showtime&gt;</w:t>
+            </w:r>
+          </w:p>
+        </w:tc>
+      </w:tr>
+      <w:tr>
+        <w:tc>
+          <w:tcPr>
+            <w:tcW w:type="dxa" w:w="2160"/>
+            <w:shd w:fill="FFFFFF"/>
+            <w:tcMar>
+              <w:top w:w="100" w:type="dxa"/>
+              <w:bottom w:w="100" w:type="dxa"/>
+              <w:left w:w="140" w:type="dxa"/>
+              <w:right w:w="140" w:type="dxa"/>
+            </w:tcMar>
+          </w:tcPr>
+          <w:p>
+            <w:pPr>
+              <w:jc w:val="center"/>
+            </w:pPr>
+            <w:r>
+              <w:rPr>
+                <w:rFonts w:ascii="Times New Roman" w:hAnsi="Times New Roman"/>
+                <w:color w:val="1E293B"/>
+                <w:sz w:val="20"/>
+              </w:rPr>
+              <w:t>RevenueSummaryDto</w:t>
+              <w:br/>
+              <w:t>(&lt;&lt;dto&gt;&gt;)</w:t>
+            </w:r>
+          </w:p>
+        </w:tc>
+        <w:tc>
+          <w:tcPr>
+            <w:tcW w:type="dxa" w:w="3600"/>
+            <w:shd w:fill="FFFFFF"/>
+            <w:tcMar>
+              <w:top w:w="100" w:type="dxa"/>
+              <w:bottom w:w="100" w:type="dxa"/>
+              <w:left w:w="140" w:type="dxa"/>
+              <w:right w:w="140" w:type="dxa"/>
+            </w:tcMar>
+          </w:tcPr>
+          <w:p>
+            <w:pPr>
+              <w:jc w:val="left"/>
+            </w:pPr>
+            <w:r>
+              <w:rPr>
+                <w:rFonts w:ascii="Times New Roman" w:hAnsi="Times New Roman"/>
+                <w:color w:val="1E293B"/>
+                <w:sz w:val="20"/>
+              </w:rPr>
+              <w:t>- grossRevenue: double</w:t>
+              <w:br/>
+              <w:t>- netRevenue: double</w:t>
+              <w:br/>
+              <w:t>- occupancyRate: double</w:t>
+              <w:br/>
+              <w:t>- averagePrice: double</w:t>
+              <w:br/>
+              <w:t>- status: PerformanceStatus</w:t>
+              <w:br/>
+              <w:t>- zoneBreakdowns: List&lt;ZoneRevenueDto&gt;</w:t>
+            </w:r>
+          </w:p>
+        </w:tc>
+        <w:tc>
+          <w:tcPr>
+            <w:tcW w:type="dxa" w:w="3600"/>
+            <w:shd w:fill="FFFFFF"/>
+            <w:tcMar>
+              <w:top w:w="100" w:type="dxa"/>
+              <w:bottom w:w="100" w:type="dxa"/>
+              <w:left w:w="140" w:type="dxa"/>
+              <w:right w:w="140" w:type="dxa"/>
+            </w:tcMar>
+          </w:tcPr>
+          <w:p>
+            <w:pPr>
+              <w:jc w:val="left"/>
+            </w:pPr>
+            <w:r>
+              <w:rPr>
+                <w:rFonts w:ascii="Times New Roman" w:hAnsi="Times New Roman"/>
+                <w:color w:val="1E293B"/>
+                <w:sz w:val="20"/>
+              </w:rPr>
+              <w:t>+ getGrossRevenue(): double</w:t>
+              <w:br/>
+              <w:t>+ getNetRevenue(): double</w:t>
+              <w:br/>
+              <w:t>+ getOccupancyRate(): double</w:t>
+            </w:r>
+          </w:p>
+        </w:tc>
+      </w:tr>
+      <w:tr>
+        <w:tc>
+          <w:tcPr>
+            <w:tcW w:type="dxa" w:w="2160"/>
+            <w:shd w:fill="F8FAFC"/>
+            <w:tcMar>
+              <w:top w:w="100" w:type="dxa"/>
+              <w:bottom w:w="100" w:type="dxa"/>
+              <w:left w:w="140" w:type="dxa"/>
+              <w:right w:w="140" w:type="dxa"/>
+            </w:tcMar>
+          </w:tcPr>
+          <w:p>
+            <w:pPr>
+              <w:jc w:val="center"/>
+            </w:pPr>
+            <w:r>
+              <w:rPr>
+                <w:rFonts w:ascii="Times New Roman" w:hAnsi="Times New Roman"/>
+                <w:color w:val="1E293B"/>
+                <w:sz w:val="20"/>
+              </w:rPr>
+              <w:t>RevenueReportController</w:t>
+              <w:br/>
+              <w:t>(&lt;&lt;control&gt;&gt;)</w:t>
+            </w:r>
+          </w:p>
+        </w:tc>
+        <w:tc>
+          <w:tcPr>
+            <w:tcW w:type="dxa" w:w="3600"/>
+            <w:shd w:fill="F8FAFC"/>
+            <w:tcMar>
+              <w:top w:w="100" w:type="dxa"/>
+              <w:bottom w:w="100" w:type="dxa"/>
+              <w:left w:w="140" w:type="dxa"/>
+              <w:right w:w="140" w:type="dxa"/>
+            </w:tcMar>
+          </w:tcPr>
+          <w:p>
+            <w:pPr>
+              <w:jc w:val="left"/>
+            </w:pPr>
+            <w:r>
+              <w:rPr>
+                <w:rFonts w:ascii="Times New Roman" w:hAnsi="Times New Roman"/>
+                <w:color w:val="1E293B"/>
+                <w:sz w:val="20"/>
+              </w:rPr>
+              <w:t>- reportService: ReportService</w:t>
+              <w:br/>
+              <w:t>- eventRepo: EventRepository</w:t>
+            </w:r>
+          </w:p>
+        </w:tc>
+        <w:tc>
+          <w:tcPr>
+            <w:tcW w:type="dxa" w:w="3600"/>
+            <w:shd w:fill="F8FAFC"/>
+            <w:tcMar>
+              <w:top w:w="100" w:type="dxa"/>
+              <w:bottom w:w="100" w:type="dxa"/>
+              <w:left w:w="140" w:type="dxa"/>
+              <w:right w:w="140" w:type="dxa"/>
+            </w:tcMar>
+          </w:tcPr>
+          <w:p>
+            <w:pPr>
+              <w:jc w:val="left"/>
+            </w:pPr>
+            <w:r>
+              <w:rPr>
+                <w:rFonts w:ascii="Times New Roman" w:hAnsi="Times New Roman"/>
+                <w:color w:val="1E293B"/>
+                <w:sz w:val="20"/>
+              </w:rPr>
+              <w:t>+ handleViewReport(eventId: Long): RevenueSummaryDto</w:t>
+              <w:br/>
+              <w:t>+ calculateZoneAnalytics(eventId: Long): List&lt;ZoneRevenueDto&gt;</w:t>
+              <w:br/>
+              <w:t>+ formatReportData(report: RevenueReport): RevenueSummaryDto</w:t>
+            </w:r>
+          </w:p>
+        </w:tc>
+      </w:tr>
+      <w:tr>
+        <w:tc>
+          <w:tcPr>
+            <w:tcW w:type="dxa" w:w="2160"/>
+            <w:shd w:fill="FFFFFF"/>
+            <w:tcMar>
+              <w:top w:w="100" w:type="dxa"/>
+              <w:bottom w:w="100" w:type="dxa"/>
+              <w:left w:w="140" w:type="dxa"/>
+              <w:right w:w="140" w:type="dxa"/>
+            </w:tcMar>
+          </w:tcPr>
+          <w:p>
+            <w:pPr>
+              <w:jc w:val="center"/>
+            </w:pPr>
+            <w:r>
+              <w:rPr>
+                <w:rFonts w:ascii="Times New Roman" w:hAnsi="Times New Roman"/>
+                <w:color w:val="1E293B"/>
+                <w:sz w:val="20"/>
+              </w:rPr>
+              <w:t>RevenueReportView</w:t>
+              <w:br/>
+              <w:t>(&lt;&lt;boundary&gt;&gt;)</w:t>
+            </w:r>
+          </w:p>
+        </w:tc>
+        <w:tc>
+          <w:tcPr>
+            <w:tcW w:type="dxa" w:w="3600"/>
+            <w:shd w:fill="FFFFFF"/>
+            <w:tcMar>
+              <w:top w:w="100" w:type="dxa"/>
+              <w:bottom w:w="100" w:type="dxa"/>
+              <w:left w:w="140" w:type="dxa"/>
+              <w:right w:w="140" w:type="dxa"/>
+            </w:tcMar>
+          </w:tcPr>
+          <w:p>
+            <w:pPr>
+              <w:jc w:val="left"/>
+            </w:pPr>
+            <w:r>
+              <w:rPr>
+                <w:rFonts w:ascii="Times New Roman" w:hAnsi="Times New Roman"/>
+                <w:color w:val="1E293B"/>
+                <w:sz w:val="20"/>
+              </w:rPr>
+              <w:t>- eventSelector: ComboBox</w:t>
+              <w:br/>
+              <w:t>- kpiPanel: Panel</w:t>
+              <w:br/>
+              <w:t>- zoneChart: ChartView</w:t>
+            </w:r>
+          </w:p>
+        </w:tc>
+        <w:tc>
+          <w:tcPr>
+            <w:tcW w:type="dxa" w:w="3600"/>
+            <w:shd w:fill="FFFFFF"/>
+            <w:tcMar>
+              <w:top w:w="100" w:type="dxa"/>
+              <w:bottom w:w="100" w:type="dxa"/>
+              <w:left w:w="140" w:type="dxa"/>
+              <w:right w:w="140" w:type="dxa"/>
+            </w:tcMar>
+          </w:tcPr>
+          <w:p>
+            <w:pPr>
+              <w:jc w:val="left"/>
+            </w:pPr>
+            <w:r>
+              <w:rPr>
+                <w:rFonts w:ascii="Times New Roman" w:hAnsi="Times New Roman"/>
+                <w:color w:val="1E293B"/>
+                <w:sz w:val="20"/>
+              </w:rPr>
+              <w:t>+ onSelectEvent(eventId: Long): void</w:t>
+              <w:br/>
+              <w:t>+ displayKPIs(dto: RevenueSummaryDto): void</w:t>
+              <w:br/>
+              <w:t>+ renderZoneChart(data: List&lt;ZoneRevenueDto&gt;): void</w:t>
+              <w:br/>
+              <w:t>+ showError(msg: String): void</w:t>
+            </w:r>
+          </w:p>
+        </w:tc>
+      </w:tr>
+    </w:tbl>
+    <w:p>
+      <w:pPr>
+        <w:spacing w:before="0" w:after="120"/>
+      </w:pPr>
     </w:p>
     <w:p>
       <w:pPr>

</xml_diff>

<commit_message>
Add detailed UI interaction and validation scenarios
</commit_message>
<xml_diff>
--- a/N12 Nhóm 01 - HoanChinh.docx
+++ b/N12 Nhóm 01 - HoanChinh.docx
@@ -7659,7 +7659,20 @@
           <w:color w:val="1D4ED8"/>
           <w:sz w:val="25"/>
         </w:rPr>
-        <w:t>4.2. Kịch bản tương tác người dùng - hệ thống (UI Interaction Scenario)</w:t>
+        <w:t>4.2. Kịch bản tương tác giao diện chi tiết (UI Storyboard Scenario)</w:t>
+      </w:r>
+    </w:p>
+    <w:p>
+      <w:pPr>
+        <w:spacing w:before="0" w:after="100" w:line="300" w:lineRule="auto"/>
+      </w:pPr>
+      <w:r>
+        <w:rPr>
+          <w:rFonts w:ascii="Times New Roman" w:hAnsi="Times New Roman"/>
+          <w:color w:val="1E293B"/>
+          <w:sz w:val="23"/>
+        </w:rPr>
+        <w:t>Kịch bản tương tác giao diện mô tả chi tiết từng bước hành động của người dùng trên màn hình RevenueReportView, sự kiện kích hoạt, cách thức hệ thống xử lý nghiệp vụ và phản hồi hiển thị tương ứng:</w:t>
       </w:r>
     </w:p>
     <w:tbl>
@@ -7677,14 +7690,16 @@
         </w:tblBorders>
       </w:tblPr>
       <w:tblGrid>
-        <w:gridCol w:w="3134"/>
-        <w:gridCol w:w="3134"/>
-        <w:gridCol w:w="3134"/>
+        <w:gridCol w:w="1881"/>
+        <w:gridCol w:w="1881"/>
+        <w:gridCol w:w="1881"/>
+        <w:gridCol w:w="1881"/>
+        <w:gridCol w:w="1881"/>
       </w:tblGrid>
       <w:tr>
         <w:tc>
           <w:tcPr>
-            <w:tcW w:type="dxa" w:w="864"/>
+            <w:tcW w:type="dxa" w:w="720"/>
             <w:shd w:fill="1E3A8A"/>
             <w:tcMar>
               <w:top w:w="140" w:type="dxa"/>
@@ -7710,7 +7725,7 @@
         </w:tc>
         <w:tc>
           <w:tcPr>
-            <w:tcW w:type="dxa" w:w="4176"/>
+            <w:tcW w:type="dxa" w:w="2592"/>
             <w:shd w:fill="1E3A8A"/>
             <w:tcMar>
               <w:top w:w="140" w:type="dxa"/>
@@ -7730,13 +7745,13 @@
                 <w:color w:val="FFFFFF"/>
                 <w:sz w:val="21"/>
               </w:rPr>
-              <w:t>Hành động của người dùng (User Action)</w:t>
-            </w:r>
-          </w:p>
-        </w:tc>
-        <w:tc>
-          <w:tcPr>
-            <w:tcW w:type="dxa" w:w="4320"/>
+              <w:t>Hành động của tác nhân (User Action)</w:t>
+            </w:r>
+          </w:p>
+        </w:tc>
+        <w:tc>
+          <w:tcPr>
+            <w:tcW w:type="dxa" w:w="1584"/>
             <w:shd w:fill="1E3A8A"/>
             <w:tcMar>
               <w:top w:w="140" w:type="dxa"/>
@@ -7756,7 +7771,59 @@
                 <w:color w:val="FFFFFF"/>
                 <w:sz w:val="21"/>
               </w:rPr>
-              <w:t>Phản hồi của hệ thống (System Response)</w:t>
+              <w:t>Sự kiện UI (Event)</w:t>
+            </w:r>
+          </w:p>
+        </w:tc>
+        <w:tc>
+          <w:tcPr>
+            <w:tcW w:type="dxa" w:w="3312"/>
+            <w:shd w:fill="1E3A8A"/>
+            <w:tcMar>
+              <w:top w:w="140" w:type="dxa"/>
+              <w:bottom w:w="140" w:type="dxa"/>
+              <w:left w:w="160" w:type="dxa"/>
+              <w:right w:w="160" w:type="dxa"/>
+            </w:tcMar>
+          </w:tcPr>
+          <w:p>
+            <w:pPr>
+              <w:jc w:val="center"/>
+            </w:pPr>
+            <w:r>
+              <w:rPr>
+                <w:rFonts w:ascii="Times New Roman" w:hAnsi="Times New Roman"/>
+                <w:b/>
+                <w:color w:val="FFFFFF"/>
+                <w:sz w:val="21"/>
+              </w:rPr>
+              <w:t>Xử lý hệ thống &amp; Phản hồi giao diện (System Response)</w:t>
+            </w:r>
+          </w:p>
+        </w:tc>
+        <w:tc>
+          <w:tcPr>
+            <w:tcW w:type="dxa" w:w="1872"/>
+            <w:shd w:fill="1E3A8A"/>
+            <w:tcMar>
+              <w:top w:w="140" w:type="dxa"/>
+              <w:bottom w:w="140" w:type="dxa"/>
+              <w:left w:w="160" w:type="dxa"/>
+              <w:right w:w="160" w:type="dxa"/>
+            </w:tcMar>
+          </w:tcPr>
+          <w:p>
+            <w:pPr>
+              <w:jc w:val="center"/>
+            </w:pPr>
+            <w:r>
+              <w:rPr>
+                <w:rFonts w:ascii="Times New Roman" w:hAnsi="Times New Roman"/>
+                <w:b/>
+                <w:color w:val="FFFFFF"/>
+                <w:sz w:val="21"/>
+              </w:rPr>
+              <w:t>Trạng thái giao diện tiếp theo (Next State)</w:t>
             </w:r>
           </w:p>
         </w:tc>
@@ -7764,7 +7831,7 @@
       <w:tr>
         <w:tc>
           <w:tcPr>
-            <w:tcW w:type="dxa" w:w="864"/>
+            <w:tcW w:type="dxa" w:w="720"/>
             <w:shd w:fill="FFFFFF"/>
             <w:tcMar>
               <w:top w:w="100" w:type="dxa"/>
@@ -7789,7 +7856,7 @@
         </w:tc>
         <w:tc>
           <w:tcPr>
-            <w:tcW w:type="dxa" w:w="4176"/>
+            <w:tcW w:type="dxa" w:w="2592"/>
             <w:shd w:fill="FFFFFF"/>
             <w:tcMar>
               <w:top w:w="100" w:type="dxa"/>
@@ -7808,13 +7875,13 @@
                 <w:color w:val="1E293B"/>
                 <w:sz w:val="20"/>
               </w:rPr>
-              <w:t>Người dùng truy cập vào mục 'Thống kê doanh thu' từ menu.</w:t>
-            </w:r>
-          </w:p>
-        </w:tc>
-        <w:tc>
-          <w:tcPr>
-            <w:tcW w:type="dxa" w:w="4320"/>
+              <w:t>Người dùng nhấp chọn mục 'Thống kê doanh thu' trên menu điều khiển.</w:t>
+            </w:r>
+          </w:p>
+        </w:tc>
+        <w:tc>
+          <w:tcPr>
+            <w:tcW w:type="dxa" w:w="1584"/>
             <w:shd w:fill="FFFFFF"/>
             <w:tcMar>
               <w:top w:w="100" w:type="dxa"/>
@@ -7833,7 +7900,57 @@
                 <w:color w:val="1E293B"/>
                 <w:sz w:val="20"/>
               </w:rPr>
-              <w:t>Hệ thống tải giao diện RevenueReportView, nạp danh sách các sự kiện vào ComboBox, đặt khoảng ngày mặc định là 30 ngày gần nhất.</w:t>
+              <w:t>OnClick (Menu_ThongKe)</w:t>
+            </w:r>
+          </w:p>
+        </w:tc>
+        <w:tc>
+          <w:tcPr>
+            <w:tcW w:type="dxa" w:w="3312"/>
+            <w:shd w:fill="FFFFFF"/>
+            <w:tcMar>
+              <w:top w:w="100" w:type="dxa"/>
+              <w:bottom w:w="100" w:type="dxa"/>
+              <w:left w:w="140" w:type="dxa"/>
+              <w:right w:w="140" w:type="dxa"/>
+            </w:tcMar>
+          </w:tcPr>
+          <w:p>
+            <w:pPr>
+              <w:jc w:val="left"/>
+            </w:pPr>
+            <w:r>
+              <w:rPr>
+                <w:rFonts w:ascii="Times New Roman" w:hAnsi="Times New Roman"/>
+                <w:color w:val="1E293B"/>
+                <w:sz w:val="20"/>
+              </w:rPr>
+              <w:t>Hệ thống gọi API lấy danh sách các sự kiện đang hoạt động. Khởi tạo màn hình RevenueReportView, nạp danh sách sự kiện vào ComboBox (cb_event), đặt khoảng ngày tra cứu mặc định là 30 ngày gần nhất.</w:t>
+            </w:r>
+          </w:p>
+        </w:tc>
+        <w:tc>
+          <w:tcPr>
+            <w:tcW w:type="dxa" w:w="1872"/>
+            <w:shd w:fill="FFFFFF"/>
+            <w:tcMar>
+              <w:top w:w="100" w:type="dxa"/>
+              <w:bottom w:w="100" w:type="dxa"/>
+              <w:left w:w="140" w:type="dxa"/>
+              <w:right w:w="140" w:type="dxa"/>
+            </w:tcMar>
+          </w:tcPr>
+          <w:p>
+            <w:pPr>
+              <w:jc w:val="left"/>
+            </w:pPr>
+            <w:r>
+              <w:rPr>
+                <w:rFonts w:ascii="Times New Roman" w:hAnsi="Times New Roman"/>
+                <w:color w:val="1E293B"/>
+                <w:sz w:val="20"/>
+              </w:rPr>
+              <w:t>Màn hình hiển thị trống (Ready): Bộ lọc sẵn sàng, các thẻ KPI và bảng biểu ở trạng thái chờ.</w:t>
             </w:r>
           </w:p>
         </w:tc>
@@ -7841,7 +7958,7 @@
       <w:tr>
         <w:tc>
           <w:tcPr>
-            <w:tcW w:type="dxa" w:w="864"/>
+            <w:tcW w:type="dxa" w:w="720"/>
             <w:shd w:fill="F8FAFC"/>
             <w:tcMar>
               <w:top w:w="100" w:type="dxa"/>
@@ -7866,7 +7983,7 @@
         </w:tc>
         <w:tc>
           <w:tcPr>
-            <w:tcW w:type="dxa" w:w="4176"/>
+            <w:tcW w:type="dxa" w:w="2592"/>
             <w:shd w:fill="F8FAFC"/>
             <w:tcMar>
               <w:top w:w="100" w:type="dxa"/>
@@ -7891,7 +8008,7 @@
         </w:tc>
         <w:tc>
           <w:tcPr>
-            <w:tcW w:type="dxa" w:w="4320"/>
+            <w:tcW w:type="dxa" w:w="1584"/>
             <w:shd w:fill="F8FAFC"/>
             <w:tcMar>
               <w:top w:w="100" w:type="dxa"/>
@@ -7910,7 +8027,57 @@
                 <w:color w:val="1E293B"/>
                 <w:sz w:val="20"/>
               </w:rPr>
-              <w:t>Hệ thống ghi nhận mã sự kiện eventId, tự động cập nhật ngày mở bán và ngày kết thúc sự kiện vào 2 ô DatePicker.</w:t>
+              <w:t>OnSelectionChange (cb_event)</w:t>
+            </w:r>
+          </w:p>
+        </w:tc>
+        <w:tc>
+          <w:tcPr>
+            <w:tcW w:type="dxa" w:w="3312"/>
+            <w:shd w:fill="F8FAFC"/>
+            <w:tcMar>
+              <w:top w:w="100" w:type="dxa"/>
+              <w:bottom w:w="100" w:type="dxa"/>
+              <w:left w:w="140" w:type="dxa"/>
+              <w:right w:w="140" w:type="dxa"/>
+            </w:tcMar>
+          </w:tcPr>
+          <w:p>
+            <w:pPr>
+              <w:jc w:val="left"/>
+            </w:pPr>
+            <w:r>
+              <w:rPr>
+                <w:rFonts w:ascii="Times New Roman" w:hAnsi="Times New Roman"/>
+                <w:color w:val="1E293B"/>
+                <w:sz w:val="20"/>
+              </w:rPr>
+              <w:t>Hệ thống ghi nhận mã sự kiện eventId, tự động truy vấn khoảng thời gian diễn ra sự kiện trong CSDL và điền sẵn vào 2 ô DatePicker dp_from_date và dp_to_date.</w:t>
+            </w:r>
+          </w:p>
+        </w:tc>
+        <w:tc>
+          <w:tcPr>
+            <w:tcW w:type="dxa" w:w="1872"/>
+            <w:shd w:fill="F8FAFC"/>
+            <w:tcMar>
+              <w:top w:w="100" w:type="dxa"/>
+              <w:bottom w:w="100" w:type="dxa"/>
+              <w:left w:w="140" w:type="dxa"/>
+              <w:right w:w="140" w:type="dxa"/>
+            </w:tcMar>
+          </w:tcPr>
+          <w:p>
+            <w:pPr>
+              <w:jc w:val="left"/>
+            </w:pPr>
+            <w:r>
+              <w:rPr>
+                <w:rFonts w:ascii="Times New Roman" w:hAnsi="Times New Roman"/>
+                <w:color w:val="1E293B"/>
+                <w:sz w:val="20"/>
+              </w:rPr>
+              <w:t>Đã nạp bộ lọc (Configured): ComboBox hiển thị sự kiện đã chọn, các ô ngày hiển thị khoảng ngày của sự kiện.</w:t>
             </w:r>
           </w:p>
         </w:tc>
@@ -7918,7 +8085,7 @@
       <w:tr>
         <w:tc>
           <w:tcPr>
-            <w:tcW w:type="dxa" w:w="864"/>
+            <w:tcW w:type="dxa" w:w="720"/>
             <w:shd w:fill="FFFFFF"/>
             <w:tcMar>
               <w:top w:w="100" w:type="dxa"/>
@@ -7943,7 +8110,7 @@
         </w:tc>
         <w:tc>
           <w:tcPr>
-            <w:tcW w:type="dxa" w:w="4176"/>
+            <w:tcW w:type="dxa" w:w="2592"/>
             <w:shd w:fill="FFFFFF"/>
             <w:tcMar>
               <w:top w:w="100" w:type="dxa"/>
@@ -7962,13 +8129,13 @@
                 <w:color w:val="1E293B"/>
                 <w:sz w:val="20"/>
               </w:rPr>
-              <w:t>Người dùng nhấp nút 'Tra cứu' (btn_search).</w:t>
-            </w:r>
-          </w:p>
-        </w:tc>
-        <w:tc>
-          <w:tcPr>
-            <w:tcW w:type="dxa" w:w="4320"/>
+              <w:t>Người dùng điều chỉnh ô ngày và nhấp chuột vào nút 'Tra cứu' (btn_search).</w:t>
+            </w:r>
+          </w:p>
+        </w:tc>
+        <w:tc>
+          <w:tcPr>
+            <w:tcW w:type="dxa" w:w="1584"/>
             <w:shd w:fill="FFFFFF"/>
             <w:tcMar>
               <w:top w:w="100" w:type="dxa"/>
@@ -7987,7 +8154,57 @@
                 <w:color w:val="1E293B"/>
                 <w:sz w:val="20"/>
               </w:rPr>
-              <w:t>Giao diện hiển thị biểu tượng tải dữ liệu (loading spinner). Controller nạp Entity RevenueReport, kích hoạt chuỗi tính toán và trả về RevenueSummaryDto.</w:t>
+              <w:t>OnClick (btn_search)</w:t>
+            </w:r>
+          </w:p>
+        </w:tc>
+        <w:tc>
+          <w:tcPr>
+            <w:tcW w:type="dxa" w:w="3312"/>
+            <w:shd w:fill="FFFFFF"/>
+            <w:tcMar>
+              <w:top w:w="100" w:type="dxa"/>
+              <w:bottom w:w="100" w:type="dxa"/>
+              <w:left w:w="140" w:type="dxa"/>
+              <w:right w:w="140" w:type="dxa"/>
+            </w:tcMar>
+          </w:tcPr>
+          <w:p>
+            <w:pPr>
+              <w:jc w:val="left"/>
+            </w:pPr>
+            <w:r>
+              <w:rPr>
+                <w:rFonts w:ascii="Times New Roman" w:hAnsi="Times New Roman"/>
+                <w:color w:val="1E293B"/>
+                <w:sz w:val="20"/>
+              </w:rPr>
+              <w:t>Giao diện vô hiệu hóa tạm thời bộ lọc (disable cb_event, btn_search) và hiển thị vòng xoay tải dữ liệu (loading spinner). Gửi yêu cầu truy vấn tài chính tới RevenueReportController.</w:t>
+            </w:r>
+          </w:p>
+        </w:tc>
+        <w:tc>
+          <w:tcPr>
+            <w:tcW w:type="dxa" w:w="1872"/>
+            <w:shd w:fill="FFFFFF"/>
+            <w:tcMar>
+              <w:top w:w="100" w:type="dxa"/>
+              <w:bottom w:w="100" w:type="dxa"/>
+              <w:left w:w="140" w:type="dxa"/>
+              <w:right w:w="140" w:type="dxa"/>
+            </w:tcMar>
+          </w:tcPr>
+          <w:p>
+            <w:pPr>
+              <w:jc w:val="left"/>
+            </w:pPr>
+            <w:r>
+              <w:rPr>
+                <w:rFonts w:ascii="Times New Roman" w:hAnsi="Times New Roman"/>
+                <w:color w:val="1E293B"/>
+                <w:sz w:val="20"/>
+              </w:rPr>
+              <w:t>Đang xử lý (Loading): Biểu tượng xoay hiển thị, người dùng không thể nhấp lại nút tra cứu.</w:t>
             </w:r>
           </w:p>
         </w:tc>
@@ -7995,7 +8212,7 @@
       <w:tr>
         <w:tc>
           <w:tcPr>
-            <w:tcW w:type="dxa" w:w="864"/>
+            <w:tcW w:type="dxa" w:w="720"/>
             <w:shd w:fill="F8FAFC"/>
             <w:tcMar>
               <w:top w:w="100" w:type="dxa"/>
@@ -8020,7 +8237,7 @@
         </w:tc>
         <w:tc>
           <w:tcPr>
-            <w:tcW w:type="dxa" w:w="4176"/>
+            <w:tcW w:type="dxa" w:w="2592"/>
             <w:shd w:fill="F8FAFC"/>
             <w:tcMar>
               <w:top w:w="100" w:type="dxa"/>
@@ -8039,13 +8256,13 @@
                 <w:color w:val="1E293B"/>
                 <w:sz w:val="20"/>
               </w:rPr>
-              <w:t>Hệ thống nhận kết quả tính toán thành công.</w:t>
-            </w:r>
-          </w:p>
-        </w:tc>
-        <w:tc>
-          <w:tcPr>
-            <w:tcW w:type="dxa" w:w="4320"/>
+              <w:t>Hệ thống thực hiện tính toán tài chính thành công và trả về RevenueSummaryDto.</w:t>
+            </w:r>
+          </w:p>
+        </w:tc>
+        <w:tc>
+          <w:tcPr>
+            <w:tcW w:type="dxa" w:w="1584"/>
             <w:shd w:fill="F8FAFC"/>
             <w:tcMar>
               <w:top w:w="100" w:type="dxa"/>
@@ -8064,7 +8281,57 @@
                 <w:color w:val="1E293B"/>
                 <w:sz w:val="20"/>
               </w:rPr>
-              <w:t>Giao diện cập nhật tức thì 4 thẻ KPI, kết xuất biểu đồ Donut tỷ trọng doanh thu bên trái và điền đầy đủ dữ liệu vào bảng chi tiết phân khu bên phải.</w:t>
+              <w:t>OnDataLoaded (Success Callback)</w:t>
+            </w:r>
+          </w:p>
+        </w:tc>
+        <w:tc>
+          <w:tcPr>
+            <w:tcW w:type="dxa" w:w="3312"/>
+            <w:shd w:fill="F8FAFC"/>
+            <w:tcMar>
+              <w:top w:w="100" w:type="dxa"/>
+              <w:bottom w:w="100" w:type="dxa"/>
+              <w:left w:w="140" w:type="dxa"/>
+              <w:right w:w="140" w:type="dxa"/>
+            </w:tcMar>
+          </w:tcPr>
+          <w:p>
+            <w:pPr>
+              <w:jc w:val="left"/>
+            </w:pPr>
+            <w:r>
+              <w:rPr>
+                <w:rFonts w:ascii="Times New Roman" w:hAnsi="Times New Roman"/>
+                <w:color w:val="1E293B"/>
+                <w:sz w:val="20"/>
+              </w:rPr>
+              <w:t>Ẩn biểu tượng xoay tải dữ liệu, kích hoạt lại bộ lọc. Nạp các giá trị số liệu vào 4 thẻ KPI; vẽ biểu đồ tròn Donut tỷ trọng phân khu; điền đầy đủ dữ liệu phân tích chi tiết vào bảng breakdown table.</w:t>
+            </w:r>
+          </w:p>
+        </w:tc>
+        <w:tc>
+          <w:tcPr>
+            <w:tcW w:type="dxa" w:w="1872"/>
+            <w:shd w:fill="F8FAFC"/>
+            <w:tcMar>
+              <w:top w:w="100" w:type="dxa"/>
+              <w:bottom w:w="100" w:type="dxa"/>
+              <w:left w:w="140" w:type="dxa"/>
+              <w:right w:w="140" w:type="dxa"/>
+            </w:tcMar>
+          </w:tcPr>
+          <w:p>
+            <w:pPr>
+              <w:jc w:val="left"/>
+            </w:pPr>
+            <w:r>
+              <w:rPr>
+                <w:rFonts w:ascii="Times New Roman" w:hAnsi="Times New Roman"/>
+                <w:color w:val="1E293B"/>
+                <w:sz w:val="20"/>
+              </w:rPr>
+              <w:t>Hiển thị báo cáo (Rendered): Toàn bộ số liệu doanh thu, biểu đồ phân khu và bảng phân tích chi tiết được hiển thị sắc nét.</w:t>
             </w:r>
           </w:p>
         </w:tc>
@@ -8072,7 +8339,7 @@
       <w:tr>
         <w:tc>
           <w:tcPr>
-            <w:tcW w:type="dxa" w:w="864"/>
+            <w:tcW w:type="dxa" w:w="720"/>
             <w:shd w:fill="FFFFFF"/>
             <w:tcMar>
               <w:top w:w="100" w:type="dxa"/>
@@ -8097,7 +8364,7 @@
         </w:tc>
         <w:tc>
           <w:tcPr>
-            <w:tcW w:type="dxa" w:w="4176"/>
+            <w:tcW w:type="dxa" w:w="2592"/>
             <w:shd w:fill="FFFFFF"/>
             <w:tcMar>
               <w:top w:w="100" w:type="dxa"/>
@@ -8116,13 +8383,13 @@
                 <w:color w:val="1E293B"/>
                 <w:sz w:val="20"/>
               </w:rPr>
-              <w:t>Người dùng rê chuột vào các phần của biểu đồ Donut.</w:t>
-            </w:r>
-          </w:p>
-        </w:tc>
-        <w:tc>
-          <w:tcPr>
-            <w:tcW w:type="dxa" w:w="4320"/>
+              <w:t>Người dùng di chuyển con trỏ chuột vào vùng phân khu 'VIP' trên biểu đồ tròn Donut.</w:t>
+            </w:r>
+          </w:p>
+        </w:tc>
+        <w:tc>
+          <w:tcPr>
+            <w:tcW w:type="dxa" w:w="1584"/>
             <w:shd w:fill="FFFFFF"/>
             <w:tcMar>
               <w:top w:w="100" w:type="dxa"/>
@@ -8141,7 +8408,57 @@
                 <w:color w:val="1E293B"/>
                 <w:sz w:val="20"/>
               </w:rPr>
-              <w:t>Hệ thống hiển thị tooltip chi tiết: Tên phân khu, doanh thu thu được và tỷ lệ phần trăm đóng góp.</w:t>
+              <w:t>OnMouseHover (chart_zone.VIP)</w:t>
+            </w:r>
+          </w:p>
+        </w:tc>
+        <w:tc>
+          <w:tcPr>
+            <w:tcW w:type="dxa" w:w="3312"/>
+            <w:shd w:fill="FFFFFF"/>
+            <w:tcMar>
+              <w:top w:w="100" w:type="dxa"/>
+              <w:bottom w:w="100" w:type="dxa"/>
+              <w:left w:w="140" w:type="dxa"/>
+              <w:right w:w="140" w:type="dxa"/>
+            </w:tcMar>
+          </w:tcPr>
+          <w:p>
+            <w:pPr>
+              <w:jc w:val="left"/>
+            </w:pPr>
+            <w:r>
+              <w:rPr>
+                <w:rFonts w:ascii="Times New Roman" w:hAnsi="Times New Roman"/>
+                <w:color w:val="1E293B"/>
+                <w:sz w:val="20"/>
+              </w:rPr>
+              <w:t>Biểu đồ Donut làm nổi bật khu vực VIP bằng hiệu ứng phóng to nhẹ (explode). Hệ thống hiển thị tooltip chi tiết: 'Phân khu: VIP | Doanh thu: 7.000.000.000đ | Tỷ trọng: 45.3%'.</w:t>
+            </w:r>
+          </w:p>
+        </w:tc>
+        <w:tc>
+          <w:tcPr>
+            <w:tcW w:type="dxa" w:w="1872"/>
+            <w:shd w:fill="FFFFFF"/>
+            <w:tcMar>
+              <w:top w:w="100" w:type="dxa"/>
+              <w:bottom w:w="100" w:type="dxa"/>
+              <w:left w:w="140" w:type="dxa"/>
+              <w:right w:w="140" w:type="dxa"/>
+            </w:tcMar>
+          </w:tcPr>
+          <w:p>
+            <w:pPr>
+              <w:jc w:val="left"/>
+            </w:pPr>
+            <w:r>
+              <w:rPr>
+                <w:rFonts w:ascii="Times New Roman" w:hAnsi="Times New Roman"/>
+                <w:color w:val="1E293B"/>
+                <w:sz w:val="20"/>
+              </w:rPr>
+              <w:t>Tương tác biểu đồ (Hovered): Tooltip chi tiết hiển thị động tại vị trí con trỏ chuột.</w:t>
             </w:r>
           </w:p>
         </w:tc>
@@ -8149,7 +8466,7 @@
       <w:tr>
         <w:tc>
           <w:tcPr>
-            <w:tcW w:type="dxa" w:w="864"/>
+            <w:tcW w:type="dxa" w:w="720"/>
             <w:shd w:fill="F8FAFC"/>
             <w:tcMar>
               <w:top w:w="100" w:type="dxa"/>
@@ -8174,7 +8491,7 @@
         </w:tc>
         <w:tc>
           <w:tcPr>
-            <w:tcW w:type="dxa" w:w="4176"/>
+            <w:tcW w:type="dxa" w:w="2592"/>
             <w:shd w:fill="F8FAFC"/>
             <w:tcMar>
               <w:top w:w="100" w:type="dxa"/>
@@ -8193,13 +8510,13 @@
                 <w:color w:val="1E293B"/>
                 <w:sz w:val="20"/>
               </w:rPr>
-              <w:t>Người dùng nhấp nút 'Xuất Excel' hoặc 'In PDF'.</w:t>
-            </w:r>
-          </w:p>
-        </w:tc>
-        <w:tc>
-          <w:tcPr>
-            <w:tcW w:type="dxa" w:w="4320"/>
+              <w:t>Người dùng nhấp chuột vào nút 'Xuất Excel' (btn_excel).</w:t>
+            </w:r>
+          </w:p>
+        </w:tc>
+        <w:tc>
+          <w:tcPr>
+            <w:tcW w:type="dxa" w:w="1584"/>
             <w:shd w:fill="F8FAFC"/>
             <w:tcMar>
               <w:top w:w="100" w:type="dxa"/>
@@ -8218,7 +8535,524 @@
                 <w:color w:val="1E293B"/>
                 <w:sz w:val="20"/>
               </w:rPr>
-              <w:t>Hệ thống gọi phương thức exportExcel()/exportPdf(), hiển thị hộp thoại tải tệp xuống máy tính của người dùng.</w:t>
+              <w:t>OnClick (btn_excel)</w:t>
+            </w:r>
+          </w:p>
+        </w:tc>
+        <w:tc>
+          <w:tcPr>
+            <w:tcW w:type="dxa" w:w="3312"/>
+            <w:shd w:fill="F8FAFC"/>
+            <w:tcMar>
+              <w:top w:w="100" w:type="dxa"/>
+              <w:bottom w:w="100" w:type="dxa"/>
+              <w:left w:w="140" w:type="dxa"/>
+              <w:right w:w="140" w:type="dxa"/>
+            </w:tcMar>
+          </w:tcPr>
+          <w:p>
+            <w:pPr>
+              <w:jc w:val="left"/>
+            </w:pPr>
+            <w:r>
+              <w:rPr>
+                <w:rFonts w:ascii="Times New Roman" w:hAnsi="Times New Roman"/>
+                <w:color w:val="1E293B"/>
+                <w:sz w:val="20"/>
+              </w:rPr>
+              <w:t>Giao diện gửi yêu cầu kết xuất tệp tới Controller. Hệ thống tạo luồng byte của file Excel, thiết lập MIME-type và hiển thị hộp thoại tải xuống tệp 'Báo_cáo_doanh_thu_BornPink_2026.xlsx'.</w:t>
+            </w:r>
+          </w:p>
+        </w:tc>
+        <w:tc>
+          <w:tcPr>
+            <w:tcW w:type="dxa" w:w="1872"/>
+            <w:shd w:fill="F8FAFC"/>
+            <w:tcMar>
+              <w:top w:w="100" w:type="dxa"/>
+              <w:bottom w:w="100" w:type="dxa"/>
+              <w:left w:w="140" w:type="dxa"/>
+              <w:right w:w="140" w:type="dxa"/>
+            </w:tcMar>
+          </w:tcPr>
+          <w:p>
+            <w:pPr>
+              <w:jc w:val="left"/>
+            </w:pPr>
+            <w:r>
+              <w:rPr>
+                <w:rFonts w:ascii="Times New Roman" w:hAnsi="Times New Roman"/>
+                <w:color w:val="1E293B"/>
+                <w:sz w:val="20"/>
+              </w:rPr>
+              <w:t>Hiển thị báo cáo (Rendered): Quá trình tải xuống tệp báo cáo hoàn tất trong nền.</w:t>
+            </w:r>
+          </w:p>
+        </w:tc>
+      </w:tr>
+    </w:tbl>
+    <w:p>
+      <w:pPr>
+        <w:spacing w:before="0" w:after="120"/>
+      </w:pPr>
+    </w:p>
+    <w:p>
+      <w:pPr>
+        <w:keepNext/>
+        <w:spacing w:before="160" w:after="60"/>
+      </w:pPr>
+      <w:r>
+        <w:rPr>
+          <w:rFonts w:ascii="Times New Roman" w:hAnsi="Times New Roman"/>
+          <w:b/>
+          <w:i/>
+          <w:color w:val="334155"/>
+          <w:sz w:val="23"/>
+        </w:rPr>
+        <w:t>4.2.1. Các kịch bản kiểm lỗi và ràng buộc giao diện (UI Validation Scenarios)</w:t>
+      </w:r>
+    </w:p>
+    <w:p>
+      <w:pPr>
+        <w:spacing w:before="0" w:after="100" w:line="300" w:lineRule="auto"/>
+      </w:pPr>
+      <w:r>
+        <w:rPr>
+          <w:rFonts w:ascii="Times New Roman" w:hAnsi="Times New Roman"/>
+          <w:color w:val="1E293B"/>
+          <w:sz w:val="23"/>
+        </w:rPr>
+        <w:t>Kịch bản xử lý các ngoại lệ và lỗi nhập liệu trên giao diện nhằm đảm bảo tính toàn vẹn của dữ liệu tra cứu và hướng dẫn người dùng sửa lỗi:</w:t>
+      </w:r>
+    </w:p>
+    <w:tbl>
+      <w:tblPr>
+        <w:tblW w:type="auto" w:w="0"/>
+        <w:jc w:val="center"/>
+        <w:tblLook w:firstColumn="1" w:firstRow="1" w:lastColumn="0" w:lastRow="0" w:noHBand="0" w:noVBand="1" w:val="04A0"/>
+        <w:tblBorders>
+          <w:top w:val="single" w:sz="6" w:space="0" w:color="CBD5E1"/>
+          <w:left w:val="none"/>
+          <w:bottom w:val="single" w:sz="8" w:space="0" w:color="1E3A8A"/>
+          <w:right w:val="none"/>
+          <w:insideH w:val="single" w:sz="4" w:space="0" w:color="CBD5E1"/>
+          <w:insideV w:val="none"/>
+        </w:tblBorders>
+      </w:tblPr>
+      <w:tblGrid>
+        <w:gridCol w:w="2351"/>
+        <w:gridCol w:w="2351"/>
+        <w:gridCol w:w="2351"/>
+        <w:gridCol w:w="2351"/>
+      </w:tblGrid>
+      <w:tr>
+        <w:tc>
+          <w:tcPr>
+            <w:tcW w:type="dxa" w:w="2160"/>
+            <w:shd w:fill="1E3A8A"/>
+            <w:tcMar>
+              <w:top w:w="140" w:type="dxa"/>
+              <w:bottom w:w="140" w:type="dxa"/>
+              <w:left w:w="160" w:type="dxa"/>
+              <w:right w:w="160" w:type="dxa"/>
+            </w:tcMar>
+          </w:tcPr>
+          <w:p>
+            <w:pPr>
+              <w:jc w:val="center"/>
+            </w:pPr>
+            <w:r>
+              <w:rPr>
+                <w:rFonts w:ascii="Times New Roman" w:hAnsi="Times New Roman"/>
+                <w:b/>
+                <w:color w:val="FFFFFF"/>
+                <w:sz w:val="21"/>
+              </w:rPr>
+              <w:t>Kịch bản ngoại lệ</w:t>
+            </w:r>
+          </w:p>
+        </w:tc>
+        <w:tc>
+          <w:tcPr>
+            <w:tcW w:type="dxa" w:w="1728"/>
+            <w:shd w:fill="1E3A8A"/>
+            <w:tcMar>
+              <w:top w:w="140" w:type="dxa"/>
+              <w:bottom w:w="140" w:type="dxa"/>
+              <w:left w:w="160" w:type="dxa"/>
+              <w:right w:w="160" w:type="dxa"/>
+            </w:tcMar>
+          </w:tcPr>
+          <w:p>
+            <w:pPr>
+              <w:jc w:val="center"/>
+            </w:pPr>
+            <w:r>
+              <w:rPr>
+                <w:rFonts w:ascii="Times New Roman" w:hAnsi="Times New Roman"/>
+                <w:b/>
+                <w:color w:val="FFFFFF"/>
+                <w:sz w:val="21"/>
+              </w:rPr>
+              <w:t>Sự kiện kích hoạt (UI Event)</w:t>
+            </w:r>
+          </w:p>
+        </w:tc>
+        <w:tc>
+          <w:tcPr>
+            <w:tcW w:type="dxa" w:w="3600"/>
+            <w:shd w:fill="1E3A8A"/>
+            <w:tcMar>
+              <w:top w:w="140" w:type="dxa"/>
+              <w:bottom w:w="140" w:type="dxa"/>
+              <w:left w:w="160" w:type="dxa"/>
+              <w:right w:w="160" w:type="dxa"/>
+            </w:tcMar>
+          </w:tcPr>
+          <w:p>
+            <w:pPr>
+              <w:jc w:val="center"/>
+            </w:pPr>
+            <w:r>
+              <w:rPr>
+                <w:rFonts w:ascii="Times New Roman" w:hAnsi="Times New Roman"/>
+                <w:b/>
+                <w:color w:val="FFFFFF"/>
+                <w:sz w:val="21"/>
+              </w:rPr>
+              <w:t>Xử lý lỗi &amp; Phản hồi giao diện (System Response)</w:t>
+            </w:r>
+          </w:p>
+        </w:tc>
+        <w:tc>
+          <w:tcPr>
+            <w:tcW w:type="dxa" w:w="1872"/>
+            <w:shd w:fill="1E3A8A"/>
+            <w:tcMar>
+              <w:top w:w="140" w:type="dxa"/>
+              <w:bottom w:w="140" w:type="dxa"/>
+              <w:left w:w="160" w:type="dxa"/>
+              <w:right w:w="160" w:type="dxa"/>
+            </w:tcMar>
+          </w:tcPr>
+          <w:p>
+            <w:pPr>
+              <w:jc w:val="center"/>
+            </w:pPr>
+            <w:r>
+              <w:rPr>
+                <w:rFonts w:ascii="Times New Roman" w:hAnsi="Times New Roman"/>
+                <w:b/>
+                <w:color w:val="FFFFFF"/>
+                <w:sz w:val="21"/>
+              </w:rPr>
+              <w:t>Trạng thái giao diện tiếp theo</w:t>
+            </w:r>
+          </w:p>
+        </w:tc>
+      </w:tr>
+      <w:tr>
+        <w:tc>
+          <w:tcPr>
+            <w:tcW w:type="dxa" w:w="2160"/>
+            <w:shd w:fill="FFFFFF"/>
+            <w:tcMar>
+              <w:top w:w="100" w:type="dxa"/>
+              <w:bottom w:w="100" w:type="dxa"/>
+              <w:left w:w="140" w:type="dxa"/>
+              <w:right w:w="140" w:type="dxa"/>
+            </w:tcMar>
+          </w:tcPr>
+          <w:p>
+            <w:pPr>
+              <w:jc w:val="center"/>
+            </w:pPr>
+            <w:r>
+              <w:rPr>
+                <w:rFonts w:ascii="Times New Roman" w:hAnsi="Times New Roman"/>
+                <w:color w:val="1E293B"/>
+                <w:sz w:val="20"/>
+              </w:rPr>
+              <w:t>Người dùng nhập ngày bắt đầu lớn hơn ngày kết thúc (dp_from_date &gt; dp_to_date)</w:t>
+            </w:r>
+          </w:p>
+        </w:tc>
+        <w:tc>
+          <w:tcPr>
+            <w:tcW w:type="dxa" w:w="1728"/>
+            <w:shd w:fill="FFFFFF"/>
+            <w:tcMar>
+              <w:top w:w="100" w:type="dxa"/>
+              <w:bottom w:w="100" w:type="dxa"/>
+              <w:left w:w="140" w:type="dxa"/>
+              <w:right w:w="140" w:type="dxa"/>
+            </w:tcMar>
+          </w:tcPr>
+          <w:p>
+            <w:pPr>
+              <w:jc w:val="left"/>
+            </w:pPr>
+            <w:r>
+              <w:rPr>
+                <w:rFonts w:ascii="Times New Roman" w:hAnsi="Times New Roman"/>
+                <w:color w:val="1E293B"/>
+                <w:sz w:val="20"/>
+              </w:rPr>
+              <w:t>OnClick (btn_search) sau khi sửa ô ngày</w:t>
+            </w:r>
+          </w:p>
+        </w:tc>
+        <w:tc>
+          <w:tcPr>
+            <w:tcW w:type="dxa" w:w="3600"/>
+            <w:shd w:fill="FFFFFF"/>
+            <w:tcMar>
+              <w:top w:w="100" w:type="dxa"/>
+              <w:bottom w:w="100" w:type="dxa"/>
+              <w:left w:w="140" w:type="dxa"/>
+              <w:right w:w="140" w:type="dxa"/>
+            </w:tcMar>
+          </w:tcPr>
+          <w:p>
+            <w:pPr>
+              <w:jc w:val="left"/>
+            </w:pPr>
+            <w:r>
+              <w:rPr>
+                <w:rFonts w:ascii="Times New Roman" w:hAnsi="Times New Roman"/>
+                <w:color w:val="1E293B"/>
+                <w:sz w:val="20"/>
+              </w:rPr>
+              <w:t>Giao diện ngăn chặn gửi yêu cầu tra cứu xuống Controller. Ô viền dp_from_date và dp_to_date chuyển sang màu đỏ cảnh báo. Hệ thống hiển thị hộp thoại pop-up: 'Lỗi: Ngày bắt đầu tra cứu không thể sau ngày kết thúc!'</w:t>
+            </w:r>
+          </w:p>
+        </w:tc>
+        <w:tc>
+          <w:tcPr>
+            <w:tcW w:type="dxa" w:w="1872"/>
+            <w:shd w:fill="FFFFFF"/>
+            <w:tcMar>
+              <w:top w:w="100" w:type="dxa"/>
+              <w:bottom w:w="100" w:type="dxa"/>
+              <w:left w:w="140" w:type="dxa"/>
+              <w:right w:w="140" w:type="dxa"/>
+            </w:tcMar>
+          </w:tcPr>
+          <w:p>
+            <w:pPr>
+              <w:jc w:val="left"/>
+            </w:pPr>
+            <w:r>
+              <w:rPr>
+                <w:rFonts w:ascii="Times New Roman" w:hAnsi="Times New Roman"/>
+                <w:color w:val="1E293B"/>
+                <w:sz w:val="20"/>
+              </w:rPr>
+              <w:t>Cảnh báo lỗi bộ lọc (Error State): Hộp thoại hiển thị nút 'Đóng', người dùng phải sửa lại ngày.</w:t>
+            </w:r>
+          </w:p>
+        </w:tc>
+      </w:tr>
+      <w:tr>
+        <w:tc>
+          <w:tcPr>
+            <w:tcW w:type="dxa" w:w="2160"/>
+            <w:shd w:fill="F8FAFC"/>
+            <w:tcMar>
+              <w:top w:w="100" w:type="dxa"/>
+              <w:bottom w:w="100" w:type="dxa"/>
+              <w:left w:w="140" w:type="dxa"/>
+              <w:right w:w="140" w:type="dxa"/>
+            </w:tcMar>
+          </w:tcPr>
+          <w:p>
+            <w:pPr>
+              <w:jc w:val="center"/>
+            </w:pPr>
+            <w:r>
+              <w:rPr>
+                <w:rFonts w:ascii="Times New Roman" w:hAnsi="Times New Roman"/>
+                <w:color w:val="1E293B"/>
+                <w:sz w:val="20"/>
+              </w:rPr>
+              <w:t>Sự kiện được chọn chưa phát sinh bất kỳ giao dịch bán vé nào</w:t>
+            </w:r>
+          </w:p>
+        </w:tc>
+        <w:tc>
+          <w:tcPr>
+            <w:tcW w:type="dxa" w:w="1728"/>
+            <w:shd w:fill="F8FAFC"/>
+            <w:tcMar>
+              <w:top w:w="100" w:type="dxa"/>
+              <w:bottom w:w="100" w:type="dxa"/>
+              <w:left w:w="140" w:type="dxa"/>
+              <w:right w:w="140" w:type="dxa"/>
+            </w:tcMar>
+          </w:tcPr>
+          <w:p>
+            <w:pPr>
+              <w:jc w:val="left"/>
+            </w:pPr>
+            <w:r>
+              <w:rPr>
+                <w:rFonts w:ascii="Times New Roman" w:hAnsi="Times New Roman"/>
+                <w:color w:val="1E293B"/>
+                <w:sz w:val="20"/>
+              </w:rPr>
+              <w:t>OnClick (btn_search) đối với sự kiện mới tạo</w:t>
+            </w:r>
+          </w:p>
+        </w:tc>
+        <w:tc>
+          <w:tcPr>
+            <w:tcW w:type="dxa" w:w="3600"/>
+            <w:shd w:fill="F8FAFC"/>
+            <w:tcMar>
+              <w:top w:w="100" w:type="dxa"/>
+              <w:bottom w:w="100" w:type="dxa"/>
+              <w:left w:w="140" w:type="dxa"/>
+              <w:right w:w="140" w:type="dxa"/>
+            </w:tcMar>
+          </w:tcPr>
+          <w:p>
+            <w:pPr>
+              <w:jc w:val="left"/>
+            </w:pPr>
+            <w:r>
+              <w:rPr>
+                <w:rFonts w:ascii="Times New Roman" w:hAnsi="Times New Roman"/>
+                <w:color w:val="1E293B"/>
+                <w:sz w:val="20"/>
+              </w:rPr>
+              <w:t>Controller trả về kết quả rỗng (empty result). Giao diện ẩn biểu đồ tròn và bảng breakdown table, đặt giá trị các thẻ KPI về '0 VNĐ' và '0%'. Hiển thị thông báo màu xám trên màn hình: 'Sự kiện hiện tại chưa phát sinh giao dịch bán vé.'</w:t>
+            </w:r>
+          </w:p>
+        </w:tc>
+        <w:tc>
+          <w:tcPr>
+            <w:tcW w:type="dxa" w:w="1872"/>
+            <w:shd w:fill="F8FAFC"/>
+            <w:tcMar>
+              <w:top w:w="100" w:type="dxa"/>
+              <w:bottom w:w="100" w:type="dxa"/>
+              <w:left w:w="140" w:type="dxa"/>
+              <w:right w:w="140" w:type="dxa"/>
+            </w:tcMar>
+          </w:tcPr>
+          <w:p>
+            <w:pPr>
+              <w:jc w:val="left"/>
+            </w:pPr>
+            <w:r>
+              <w:rPr>
+                <w:rFonts w:ascii="Times New Roman" w:hAnsi="Times New Roman"/>
+                <w:color w:val="1E293B"/>
+                <w:sz w:val="20"/>
+              </w:rPr>
+              <w:t>Báo cáo rỗng (No Data State): Bộ lọc giữ nguyên trạng thái hoạt động để người dùng chọn sự kiện khác.</w:t>
+            </w:r>
+          </w:p>
+        </w:tc>
+      </w:tr>
+      <w:tr>
+        <w:tc>
+          <w:tcPr>
+            <w:tcW w:type="dxa" w:w="2160"/>
+            <w:shd w:fill="FFFFFF"/>
+            <w:tcMar>
+              <w:top w:w="100" w:type="dxa"/>
+              <w:bottom w:w="100" w:type="dxa"/>
+              <w:left w:w="140" w:type="dxa"/>
+              <w:right w:w="140" w:type="dxa"/>
+            </w:tcMar>
+          </w:tcPr>
+          <w:p>
+            <w:pPr>
+              <w:jc w:val="center"/>
+            </w:pPr>
+            <w:r>
+              <w:rPr>
+                <w:rFonts w:ascii="Times New Roman" w:hAnsi="Times New Roman"/>
+                <w:color w:val="1E293B"/>
+                <w:sz w:val="20"/>
+              </w:rPr>
+              <w:t>Mất kết nối mạng hoặc máy chủ cơ sở dữ liệu gặp sự cố</w:t>
+            </w:r>
+          </w:p>
+        </w:tc>
+        <w:tc>
+          <w:tcPr>
+            <w:tcW w:type="dxa" w:w="1728"/>
+            <w:shd w:fill="FFFFFF"/>
+            <w:tcMar>
+              <w:top w:w="100" w:type="dxa"/>
+              <w:bottom w:w="100" w:type="dxa"/>
+              <w:left w:w="140" w:type="dxa"/>
+              <w:right w:w="140" w:type="dxa"/>
+            </w:tcMar>
+          </w:tcPr>
+          <w:p>
+            <w:pPr>
+              <w:jc w:val="left"/>
+            </w:pPr>
+            <w:r>
+              <w:rPr>
+                <w:rFonts w:ascii="Times New Roman" w:hAnsi="Times New Roman"/>
+                <w:color w:val="1E293B"/>
+                <w:sz w:val="20"/>
+              </w:rPr>
+              <w:t>OnClick (btn_search) khi mất tín hiệu</w:t>
+            </w:r>
+          </w:p>
+        </w:tc>
+        <w:tc>
+          <w:tcPr>
+            <w:tcW w:type="dxa" w:w="3600"/>
+            <w:shd w:fill="FFFFFF"/>
+            <w:tcMar>
+              <w:top w:w="100" w:type="dxa"/>
+              <w:bottom w:w="100" w:type="dxa"/>
+              <w:left w:w="140" w:type="dxa"/>
+              <w:right w:w="140" w:type="dxa"/>
+            </w:tcMar>
+          </w:tcPr>
+          <w:p>
+            <w:pPr>
+              <w:jc w:val="left"/>
+            </w:pPr>
+            <w:r>
+              <w:rPr>
+                <w:rFonts w:ascii="Times New Roman" w:hAnsi="Times New Roman"/>
+                <w:color w:val="1E293B"/>
+                <w:sz w:val="20"/>
+              </w:rPr>
+              <w:t>Hệ thống phát hiện lỗi kết nối (Timeout/Connection Refused). Giao diện ẩn loading spinner, hiển thị thông báo lỗi màu đỏ nổi bật: 'Mất kết nối tới máy chủ. Vui lòng kiểm tra lại đường truyền mạng hoặc liên hệ quản trị viên!'</w:t>
+            </w:r>
+          </w:p>
+        </w:tc>
+        <w:tc>
+          <w:tcPr>
+            <w:tcW w:type="dxa" w:w="1872"/>
+            <w:shd w:fill="FFFFFF"/>
+            <w:tcMar>
+              <w:top w:w="100" w:type="dxa"/>
+              <w:bottom w:w="100" w:type="dxa"/>
+              <w:left w:w="140" w:type="dxa"/>
+              <w:right w:w="140" w:type="dxa"/>
+            </w:tcMar>
+          </w:tcPr>
+          <w:p>
+            <w:pPr>
+              <w:jc w:val="left"/>
+            </w:pPr>
+            <w:r>
+              <w:rPr>
+                <w:rFonts w:ascii="Times New Roman" w:hAnsi="Times New Roman"/>
+                <w:color w:val="1E293B"/>
+                <w:sz w:val="20"/>
+              </w:rPr>
+              <w:t>Lỗi kết nối (Network Error): Giữ nguyên giao diện ban đầu để người dùng thử lại khi mạng ổn định.</w:t>
             </w:r>
           </w:p>
         </w:tc>

</xml_diff>